<commit_message>
Free downloads: Prowi brand styling for provision-skabelon.xlsx and provisionsaftale-skabelon.docx
- Real Prowi logo (from the PW Nav SVG), brand palette, hairline borders, light large headings
- xlsx: lavender input cells with purple border ("lavendel felter"), branded statement on Opgørelse, print footers; all formulas and results unchanged
- docx: logo header, branded footer with page numbers, title block, lavender guidance boxes and fill-in fields; includes the section 9 wording on the 12,5 % rulings

Co-Authored-By: Claude Opus 5.5 <noreply@anthropic.com>
Claude-Session: https://claude.ai/code/session_015ARYWPzfpSsGpTMdh999ce
</commit_message>
<xml_diff>
--- a/downloads/provisionsaftale-skabelon.docx
+++ b/downloads/provisionsaftale-skabelon.docx
@@ -4,37 +4,75 @@
   <w:body>
     <w:p>
       <w:pPr>
-        <w:spacing w:after="200"/>
-      </w:pPr>
-      <w:r>
-        <w:rPr>
-          <w:rFonts w:ascii="Arial" w:cs="Arial" w:eastAsia="Arial" w:hAnsi="Arial"/>
-          <w:b/>
-          <w:bCs/>
-          <w:color w:val="1F2A44"/>
-          <w:sz w:val="34"/>
-          <w:szCs w:val="34"/>
-        </w:rPr>
-        <w:t xml:space="preserve">Tillæg til ansættelseskontrakt: Provisionsaftale</w:t>
+        <w:keepNext/>
+        <w:spacing w:after="60" w:before="240"/>
+      </w:pPr>
+      <w:r>
+        <w:rPr>
+          <w:rFonts w:ascii="Arial" w:cs="Arial" w:eastAsia="Arial" w:hAnsi="Arial"/>
+          <w:color w:val="4C39CA"/>
+          <w:sz w:val="26"/>
+          <w:szCs w:val="26"/>
+        </w:rPr>
+        <w:t xml:space="preserve">Tillæg til ansættelseskontrakt:</w:t>
+      </w:r>
+    </w:p>
+    <w:p>
+      <w:pPr>
+        <w:keepNext/>
+        <w:spacing w:after="0" w:before="0"/>
+      </w:pPr>
+      <w:r>
+        <w:rPr>
+          <w:rFonts w:ascii="Arial" w:cs="Arial" w:eastAsia="Arial" w:hAnsi="Arial"/>
+          <w:color w:val="110663"/>
+          <w:sz w:val="64"/>
+          <w:szCs w:val="64"/>
+        </w:rPr>
+        <w:t xml:space="preserve">Provisionsaftale</w:t>
       </w:r>
     </w:p>
     <w:p>
       <w:pPr>
         <w:pBdr>
-          <w:top w:val="single" w:color="C00000" w:sz="6" w:space="4"/>
-          <w:left w:val="single" w:color="C00000" w:sz="6" w:space="4"/>
-          <w:bottom w:val="single" w:color="C00000" w:sz="6" w:space="4"/>
-          <w:right w:val="single" w:color="C00000" w:sz="6" w:space="4"/>
+          <w:bottom w:val="single" w:color="46D3F7" w:sz="24" w:space="1"/>
         </w:pBdr>
-        <w:shd w:fill="FBEAEA" w:color="auto" w:val="clear"/>
-        <w:spacing w:after="200"/>
-      </w:pPr>
-      <w:r>
-        <w:rPr>
-          <w:rFonts w:ascii="Arial" w:cs="Arial" w:eastAsia="Arial" w:hAnsi="Arial"/>
-          <w:b/>
-          <w:bCs/>
-          <w:color w:val="7A1F1F"/>
+        <w:spacing w:after="160" w:before="120"/>
+        <w:ind w:right="7726"/>
+      </w:pPr>
+    </w:p>
+    <w:p>
+      <w:pPr>
+        <w:spacing w:after="360"/>
+      </w:pPr>
+      <w:r>
+        <w:rPr>
+          <w:rFonts w:ascii="Arial" w:cs="Arial" w:eastAsia="Arial" w:hAnsi="Arial"/>
+          <w:color w:val="A1A0BD"/>
+          <w:sz w:val="22"/>
+          <w:szCs w:val="22"/>
+        </w:rPr>
+        <w:t xml:space="preserve">Skabelon med vejledning · Gratis fra Prowi</w:t>
+      </w:r>
+    </w:p>
+    <w:p>
+      <w:pPr>
+        <w:pBdr>
+          <w:top w:val="single" w:color="F4F1FE" w:sz="4" w:space="6"/>
+          <w:left w:val="single" w:color="4C39CA" w:sz="18" w:space="6"/>
+          <w:bottom w:val="single" w:color="F4F1FE" w:sz="4" w:space="6"/>
+          <w:right w:val="single" w:color="F4F1FE" w:sz="4" w:space="6"/>
+        </w:pBdr>
+        <w:shd w:fill="F4F1FE" w:color="auto" w:val="clear"/>
+        <w:spacing w:after="240" w:line="276"/>
+        <w:ind w:left="140" w:right="120"/>
+      </w:pPr>
+      <w:r>
+        <w:rPr>
+          <w:rFonts w:ascii="Arial" w:cs="Arial" w:eastAsia="Arial" w:hAnsi="Arial"/>
+          <w:b/>
+          <w:bCs/>
+          <w:color w:val="110663"/>
           <w:sz w:val="21"/>
           <w:szCs w:val="21"/>
         </w:rPr>
@@ -44,10 +82,14 @@
     <w:p>
       <w:pPr>
         <w:pBdr>
-          <w:left w:val="single" w:color="BFBFBF" w:sz="12" w:space="8"/>
+          <w:top w:val="single" w:color="F4F1FE" w:sz="4" w:space="6"/>
+          <w:left w:val="single" w:color="F4F1FE" w:sz="4" w:space="6"/>
+          <w:bottom w:val="single" w:color="F4F1FE" w:sz="4" w:space="6"/>
+          <w:right w:val="single" w:color="F4F1FE" w:sz="4" w:space="6"/>
         </w:pBdr>
-        <w:spacing w:after="160" w:line="264"/>
-        <w:ind w:left="567"/>
+        <w:shd w:fill="F4F1FE" w:color="auto" w:val="clear"/>
+        <w:spacing w:after="220" w:before="120" w:line="264"/>
+        <w:ind w:left="687" w:right="120"/>
       </w:pPr>
       <w:r>
         <w:rPr>
@@ -56,7 +98,7 @@
           <w:bCs/>
           <w:i/>
           <w:iCs/>
-          <w:color w:val="595959"/>
+          <w:color w:val="4C39CA"/>
           <w:sz w:val="19"/>
           <w:szCs w:val="19"/>
         </w:rPr>
@@ -67,7 +109,7 @@
           <w:rFonts w:ascii="Arial" w:cs="Arial" w:eastAsia="Arial" w:hAnsi="Arial"/>
           <w:i/>
           <w:iCs/>
-          <w:color w:val="595959"/>
+          <w:color w:val="4A4775"/>
           <w:sz w:val="19"/>
           <w:szCs w:val="19"/>
         </w:rPr>
@@ -78,19 +120,19 @@
           <w:rFonts w:ascii="Arial" w:cs="Arial" w:eastAsia="Arial" w:hAnsi="Arial"/>
           <w:i/>
           <w:iCs/>
-          <w:color w:val="595959"/>
+          <w:color w:val="4C39CA"/>
           <w:sz w:val="19"/>
           <w:szCs w:val="19"/>
-          <w:highlight w:val="yellow"/>
-        </w:rPr>
-        <w:t xml:space="preserve">[gule klammer]</w:t>
+          <w:shd w:fill="E6E0FB" w:color="auto" w:val="clear"/>
+        </w:rPr>
+        <w:t xml:space="preserve">[lavendel klammer]</w:t>
       </w:r>
       <w:r>
         <w:rPr>
           <w:rFonts w:ascii="Arial" w:cs="Arial" w:eastAsia="Arial" w:hAnsi="Arial"/>
           <w:i/>
           <w:iCs/>
-          <w:color w:val="595959"/>
+          <w:color w:val="4A4775"/>
           <w:sz w:val="19"/>
           <w:szCs w:val="19"/>
         </w:rPr>
@@ -101,10 +143,10 @@
           <w:rFonts w:ascii="Arial" w:cs="Arial" w:eastAsia="Arial" w:hAnsi="Arial"/>
           <w:i/>
           <w:iCs/>
-          <w:color w:val="595959"/>
+          <w:color w:val="4C39CA"/>
           <w:sz w:val="19"/>
           <w:szCs w:val="19"/>
-          <w:highlight w:val="yellow"/>
+          <w:shd w:fill="E6E0FB" w:color="auto" w:val="clear"/>
         </w:rPr>
         <w:t xml:space="preserve">[Vælg: ... / ...]</w:t>
       </w:r>
@@ -113,7 +155,7 @@
           <w:rFonts w:ascii="Arial" w:cs="Arial" w:eastAsia="Arial" w:hAnsi="Arial"/>
           <w:i/>
           <w:iCs/>
-          <w:color w:val="595959"/>
+          <w:color w:val="4A4775"/>
           <w:sz w:val="19"/>
           <w:szCs w:val="19"/>
         </w:rPr>
@@ -124,16 +166,16 @@
       <w:pPr>
         <w:pStyle w:val="Heading2"/>
         <w:keepNext/>
-        <w:spacing w:after="120" w:before="280"/>
-      </w:pPr>
-      <w:r>
-        <w:rPr>
-          <w:rFonts w:ascii="Arial" w:cs="Arial" w:eastAsia="Arial" w:hAnsi="Arial"/>
-          <w:b/>
-          <w:bCs/>
-          <w:color w:val="1F2A44"/>
-          <w:sz w:val="24"/>
-          <w:szCs w:val="24"/>
+        <w:spacing w:after="140" w:before="400"/>
+      </w:pPr>
+      <w:r>
+        <w:rPr>
+          <w:rFonts w:ascii="Arial" w:cs="Arial" w:eastAsia="Arial" w:hAnsi="Arial"/>
+          <w:b w:val="false"/>
+          <w:bCs w:val="false"/>
+          <w:color w:val="110663"/>
+          <w:sz w:val="30"/>
+          <w:szCs w:val="30"/>
         </w:rPr>
         <w:t xml:space="preserve">1. Parter og ikrafttræden</w:t>
       </w:r>
@@ -149,6 +191,9 @@
       <w:r>
         <w:rPr>
           <w:rFonts w:ascii="Arial" w:cs="Arial" w:eastAsia="Arial" w:hAnsi="Arial"/>
+          <w:b/>
+          <w:bCs/>
+          <w:color w:val="4C39CA"/>
           <w:sz w:val="21"/>
           <w:szCs w:val="21"/>
         </w:rPr>
@@ -163,6 +208,7 @@
       <w:r>
         <w:rPr>
           <w:rFonts w:ascii="Arial" w:cs="Arial" w:eastAsia="Arial" w:hAnsi="Arial"/>
+          <w:color w:val="110663"/>
           <w:sz w:val="21"/>
           <w:szCs w:val="21"/>
         </w:rPr>
@@ -171,15 +217,17 @@
       <w:r>
         <w:rPr>
           <w:rFonts w:ascii="Arial" w:cs="Arial" w:eastAsia="Arial" w:hAnsi="Arial"/>
-          <w:sz w:val="21"/>
-          <w:szCs w:val="21"/>
-          <w:highlight w:val="yellow"/>
+          <w:color w:val="4C39CA"/>
+          <w:sz w:val="21"/>
+          <w:szCs w:val="21"/>
+          <w:shd w:fill="E6E0FB" w:color="auto" w:val="clear"/>
         </w:rPr>
         <w:t xml:space="preserve">[Virksomhedens navn]</w:t>
       </w:r>
       <w:r>
         <w:rPr>
           <w:rFonts w:ascii="Arial" w:cs="Arial" w:eastAsia="Arial" w:hAnsi="Arial"/>
+          <w:color w:val="110663"/>
           <w:sz w:val="21"/>
           <w:szCs w:val="21"/>
         </w:rPr>
@@ -188,15 +236,17 @@
       <w:r>
         <w:rPr>
           <w:rFonts w:ascii="Arial" w:cs="Arial" w:eastAsia="Arial" w:hAnsi="Arial"/>
-          <w:sz w:val="21"/>
-          <w:szCs w:val="21"/>
-          <w:highlight w:val="yellow"/>
+          <w:color w:val="4C39CA"/>
+          <w:sz w:val="21"/>
+          <w:szCs w:val="21"/>
+          <w:shd w:fill="E6E0FB" w:color="auto" w:val="clear"/>
         </w:rPr>
         <w:t xml:space="preserve">[00000000]</w:t>
       </w:r>
       <w:r>
         <w:rPr>
           <w:rFonts w:ascii="Arial" w:cs="Arial" w:eastAsia="Arial" w:hAnsi="Arial"/>
+          <w:color w:val="110663"/>
           <w:sz w:val="21"/>
           <w:szCs w:val="21"/>
         </w:rPr>
@@ -205,15 +255,17 @@
       <w:r>
         <w:rPr>
           <w:rFonts w:ascii="Arial" w:cs="Arial" w:eastAsia="Arial" w:hAnsi="Arial"/>
-          <w:sz w:val="21"/>
-          <w:szCs w:val="21"/>
-          <w:highlight w:val="yellow"/>
+          <w:color w:val="4C39CA"/>
+          <w:sz w:val="21"/>
+          <w:szCs w:val="21"/>
+          <w:shd w:fill="E6E0FB" w:color="auto" w:val="clear"/>
         </w:rPr>
         <w:t xml:space="preserve">[adresse]</w:t>
       </w:r>
       <w:r>
         <w:rPr>
           <w:rFonts w:ascii="Arial" w:cs="Arial" w:eastAsia="Arial" w:hAnsi="Arial"/>
+          <w:color w:val="110663"/>
           <w:sz w:val="21"/>
           <w:szCs w:val="21"/>
         </w:rPr>
@@ -231,6 +283,9 @@
       <w:r>
         <w:rPr>
           <w:rFonts w:ascii="Arial" w:cs="Arial" w:eastAsia="Arial" w:hAnsi="Arial"/>
+          <w:b/>
+          <w:bCs/>
+          <w:color w:val="4C39CA"/>
           <w:sz w:val="21"/>
           <w:szCs w:val="21"/>
         </w:rPr>
@@ -245,6 +300,7 @@
       <w:r>
         <w:rPr>
           <w:rFonts w:ascii="Arial" w:cs="Arial" w:eastAsia="Arial" w:hAnsi="Arial"/>
+          <w:color w:val="110663"/>
           <w:sz w:val="21"/>
           <w:szCs w:val="21"/>
         </w:rPr>
@@ -253,15 +309,17 @@
       <w:r>
         <w:rPr>
           <w:rFonts w:ascii="Arial" w:cs="Arial" w:eastAsia="Arial" w:hAnsi="Arial"/>
-          <w:sz w:val="21"/>
-          <w:szCs w:val="21"/>
-          <w:highlight w:val="yellow"/>
+          <w:color w:val="4C39CA"/>
+          <w:sz w:val="21"/>
+          <w:szCs w:val="21"/>
+          <w:shd w:fill="E6E0FB" w:color="auto" w:val="clear"/>
         </w:rPr>
         <w:t xml:space="preserve">[Navn]</w:t>
       </w:r>
       <w:r>
         <w:rPr>
           <w:rFonts w:ascii="Arial" w:cs="Arial" w:eastAsia="Arial" w:hAnsi="Arial"/>
+          <w:color w:val="110663"/>
           <w:sz w:val="21"/>
           <w:szCs w:val="21"/>
         </w:rPr>
@@ -270,15 +328,17 @@
       <w:r>
         <w:rPr>
           <w:rFonts w:ascii="Arial" w:cs="Arial" w:eastAsia="Arial" w:hAnsi="Arial"/>
-          <w:sz w:val="21"/>
-          <w:szCs w:val="21"/>
-          <w:highlight w:val="yellow"/>
+          <w:color w:val="4C39CA"/>
+          <w:sz w:val="21"/>
+          <w:szCs w:val="21"/>
+          <w:shd w:fill="E6E0FB" w:color="auto" w:val="clear"/>
         </w:rPr>
         <w:t xml:space="preserve">[adresse]</w:t>
       </w:r>
       <w:r>
         <w:rPr>
           <w:rFonts w:ascii="Arial" w:cs="Arial" w:eastAsia="Arial" w:hAnsi="Arial"/>
+          <w:color w:val="110663"/>
           <w:sz w:val="21"/>
           <w:szCs w:val="21"/>
         </w:rPr>
@@ -287,15 +347,17 @@
       <w:r>
         <w:rPr>
           <w:rFonts w:ascii="Arial" w:cs="Arial" w:eastAsia="Arial" w:hAnsi="Arial"/>
-          <w:sz w:val="21"/>
-          <w:szCs w:val="21"/>
-          <w:highlight w:val="yellow"/>
+          <w:color w:val="4C39CA"/>
+          <w:sz w:val="21"/>
+          <w:szCs w:val="21"/>
+          <w:shd w:fill="E6E0FB" w:color="auto" w:val="clear"/>
         </w:rPr>
         <w:t xml:space="preserve">[stillingsbetegnelse]</w:t>
       </w:r>
       <w:r>
         <w:rPr>
           <w:rFonts w:ascii="Arial" w:cs="Arial" w:eastAsia="Arial" w:hAnsi="Arial"/>
+          <w:color w:val="110663"/>
           <w:sz w:val="21"/>
           <w:szCs w:val="21"/>
         </w:rPr>
@@ -313,6 +375,9 @@
       <w:r>
         <w:rPr>
           <w:rFonts w:ascii="Arial" w:cs="Arial" w:eastAsia="Arial" w:hAnsi="Arial"/>
+          <w:b/>
+          <w:bCs/>
+          <w:color w:val="4C39CA"/>
           <w:sz w:val="21"/>
           <w:szCs w:val="21"/>
         </w:rPr>
@@ -327,6 +392,7 @@
       <w:r>
         <w:rPr>
           <w:rFonts w:ascii="Arial" w:cs="Arial" w:eastAsia="Arial" w:hAnsi="Arial"/>
+          <w:color w:val="110663"/>
           <w:sz w:val="21"/>
           <w:szCs w:val="21"/>
         </w:rPr>
@@ -335,15 +401,17 @@
       <w:r>
         <w:rPr>
           <w:rFonts w:ascii="Arial" w:cs="Arial" w:eastAsia="Arial" w:hAnsi="Arial"/>
-          <w:sz w:val="21"/>
-          <w:szCs w:val="21"/>
-          <w:highlight w:val="yellow"/>
+          <w:color w:val="4C39CA"/>
+          <w:sz w:val="21"/>
+          <w:szCs w:val="21"/>
+          <w:shd w:fill="E6E0FB" w:color="auto" w:val="clear"/>
         </w:rPr>
         <w:t xml:space="preserve">[dato]</w:t>
       </w:r>
       <w:r>
         <w:rPr>
           <w:rFonts w:ascii="Arial" w:cs="Arial" w:eastAsia="Arial" w:hAnsi="Arial"/>
+          <w:color w:val="110663"/>
           <w:sz w:val="21"/>
           <w:szCs w:val="21"/>
         </w:rPr>
@@ -352,15 +420,17 @@
       <w:r>
         <w:rPr>
           <w:rFonts w:ascii="Arial" w:cs="Arial" w:eastAsia="Arial" w:hAnsi="Arial"/>
-          <w:sz w:val="21"/>
-          <w:szCs w:val="21"/>
-          <w:highlight w:val="yellow"/>
+          <w:color w:val="4C39CA"/>
+          <w:sz w:val="21"/>
+          <w:szCs w:val="21"/>
+          <w:shd w:fill="E6E0FB" w:color="auto" w:val="clear"/>
         </w:rPr>
         <w:t xml:space="preserve">[dato]</w:t>
       </w:r>
       <w:r>
         <w:rPr>
           <w:rFonts w:ascii="Arial" w:cs="Arial" w:eastAsia="Arial" w:hAnsi="Arial"/>
+          <w:color w:val="110663"/>
           <w:sz w:val="21"/>
           <w:szCs w:val="21"/>
         </w:rPr>
@@ -369,15 +439,17 @@
       <w:r>
         <w:rPr>
           <w:rFonts w:ascii="Arial" w:cs="Arial" w:eastAsia="Arial" w:hAnsi="Arial"/>
-          <w:sz w:val="21"/>
-          <w:szCs w:val="21"/>
-          <w:highlight w:val="yellow"/>
+          <w:color w:val="4C39CA"/>
+          <w:sz w:val="21"/>
+          <w:szCs w:val="21"/>
+          <w:shd w:fill="E6E0FB" w:color="auto" w:val="clear"/>
         </w:rPr>
         <w:t xml:space="preserve">[Vælg: provisionsaftalen af dato / ingen tidligere aftale]</w:t>
       </w:r>
       <w:r>
         <w:rPr>
           <w:rFonts w:ascii="Arial" w:cs="Arial" w:eastAsia="Arial" w:hAnsi="Arial"/>
+          <w:color w:val="110663"/>
           <w:sz w:val="21"/>
           <w:szCs w:val="21"/>
         </w:rPr>
@@ -395,6 +467,9 @@
       <w:r>
         <w:rPr>
           <w:rFonts w:ascii="Arial" w:cs="Arial" w:eastAsia="Arial" w:hAnsi="Arial"/>
+          <w:b/>
+          <w:bCs/>
+          <w:color w:val="4C39CA"/>
           <w:sz w:val="21"/>
           <w:szCs w:val="21"/>
         </w:rPr>
@@ -409,6 +484,7 @@
       <w:r>
         <w:rPr>
           <w:rFonts w:ascii="Arial" w:cs="Arial" w:eastAsia="Arial" w:hAnsi="Arial"/>
+          <w:color w:val="110663"/>
           <w:sz w:val="21"/>
           <w:szCs w:val="21"/>
         </w:rPr>
@@ -418,10 +494,14 @@
     <w:p>
       <w:pPr>
         <w:pBdr>
-          <w:left w:val="single" w:color="BFBFBF" w:sz="12" w:space="8"/>
+          <w:top w:val="single" w:color="F4F1FE" w:sz="4" w:space="6"/>
+          <w:left w:val="single" w:color="F4F1FE" w:sz="4" w:space="6"/>
+          <w:bottom w:val="single" w:color="F4F1FE" w:sz="4" w:space="6"/>
+          <w:right w:val="single" w:color="F4F1FE" w:sz="4" w:space="6"/>
         </w:pBdr>
-        <w:spacing w:after="160" w:line="264"/>
-        <w:ind w:left="567"/>
+        <w:shd w:fill="F4F1FE" w:color="auto" w:val="clear"/>
+        <w:spacing w:after="220" w:before="120" w:line="264"/>
+        <w:ind w:left="687" w:right="120"/>
       </w:pPr>
       <w:r>
         <w:rPr>
@@ -430,7 +510,7 @@
           <w:bCs/>
           <w:i/>
           <w:iCs/>
-          <w:color w:val="595959"/>
+          <w:color w:val="4C39CA"/>
           <w:sz w:val="19"/>
           <w:szCs w:val="19"/>
         </w:rPr>
@@ -441,7 +521,7 @@
           <w:rFonts w:ascii="Arial" w:cs="Arial" w:eastAsia="Arial" w:hAnsi="Arial"/>
           <w:i/>
           <w:iCs/>
-          <w:color w:val="595959"/>
+          <w:color w:val="4A4775"/>
           <w:sz w:val="19"/>
           <w:szCs w:val="19"/>
         </w:rPr>
@@ -452,16 +532,16 @@
       <w:pPr>
         <w:pStyle w:val="Heading2"/>
         <w:keepNext/>
-        <w:spacing w:after="120" w:before="280"/>
-      </w:pPr>
-      <w:r>
-        <w:rPr>
-          <w:rFonts w:ascii="Arial" w:cs="Arial" w:eastAsia="Arial" w:hAnsi="Arial"/>
-          <w:b/>
-          <w:bCs/>
-          <w:color w:val="1F2A44"/>
-          <w:sz w:val="24"/>
-          <w:szCs w:val="24"/>
+        <w:spacing w:after="140" w:before="400"/>
+      </w:pPr>
+      <w:r>
+        <w:rPr>
+          <w:rFonts w:ascii="Arial" w:cs="Arial" w:eastAsia="Arial" w:hAnsi="Arial"/>
+          <w:b w:val="false"/>
+          <w:bCs w:val="false"/>
+          <w:color w:val="110663"/>
+          <w:sz w:val="30"/>
+          <w:szCs w:val="30"/>
         </w:rPr>
         <w:t xml:space="preserve">2. Provisionsgrundlag</w:t>
       </w:r>
@@ -477,6 +557,9 @@
       <w:r>
         <w:rPr>
           <w:rFonts w:ascii="Arial" w:cs="Arial" w:eastAsia="Arial" w:hAnsi="Arial"/>
+          <w:b/>
+          <w:bCs/>
+          <w:color w:val="4C39CA"/>
           <w:sz w:val="21"/>
           <w:szCs w:val="21"/>
         </w:rPr>
@@ -491,6 +574,7 @@
       <w:r>
         <w:rPr>
           <w:rFonts w:ascii="Arial" w:cs="Arial" w:eastAsia="Arial" w:hAnsi="Arial"/>
+          <w:color w:val="110663"/>
           <w:sz w:val="21"/>
           <w:szCs w:val="21"/>
         </w:rPr>
@@ -499,15 +583,17 @@
       <w:r>
         <w:rPr>
           <w:rFonts w:ascii="Arial" w:cs="Arial" w:eastAsia="Arial" w:hAnsi="Arial"/>
-          <w:sz w:val="21"/>
-          <w:szCs w:val="21"/>
-          <w:highlight w:val="yellow"/>
+          <w:color w:val="4C39CA"/>
+          <w:sz w:val="21"/>
+          <w:szCs w:val="21"/>
+          <w:shd w:fill="E6E0FB" w:color="auto" w:val="clear"/>
         </w:rPr>
         <w:t xml:space="preserve">[Virksomhedens produkter og ydelser / angiv produktgrupper]</w:t>
       </w:r>
       <w:r>
         <w:rPr>
           <w:rFonts w:ascii="Arial" w:cs="Arial" w:eastAsia="Arial" w:hAnsi="Arial"/>
+          <w:color w:val="110663"/>
           <w:sz w:val="21"/>
           <w:szCs w:val="21"/>
         </w:rPr>
@@ -516,15 +602,17 @@
       <w:r>
         <w:rPr>
           <w:rFonts w:ascii="Arial" w:cs="Arial" w:eastAsia="Arial" w:hAnsi="Arial"/>
-          <w:sz w:val="21"/>
-          <w:szCs w:val="21"/>
-          <w:highlight w:val="yellow"/>
+          <w:color w:val="4C39CA"/>
+          <w:sz w:val="21"/>
+          <w:szCs w:val="21"/>
+          <w:shd w:fill="E6E0FB" w:color="auto" w:val="clear"/>
         </w:rPr>
         <w:t xml:space="preserve">[område, segment eller kundeliste]</w:t>
       </w:r>
       <w:r>
         <w:rPr>
           <w:rFonts w:ascii="Arial" w:cs="Arial" w:eastAsia="Arial" w:hAnsi="Arial"/>
+          <w:color w:val="110663"/>
           <w:sz w:val="21"/>
           <w:szCs w:val="21"/>
         </w:rPr>
@@ -542,6 +630,9 @@
       <w:r>
         <w:rPr>
           <w:rFonts w:ascii="Arial" w:cs="Arial" w:eastAsia="Arial" w:hAnsi="Arial"/>
+          <w:b/>
+          <w:bCs/>
+          <w:color w:val="4C39CA"/>
           <w:sz w:val="21"/>
           <w:szCs w:val="21"/>
         </w:rPr>
@@ -556,6 +647,7 @@
       <w:r>
         <w:rPr>
           <w:rFonts w:ascii="Arial" w:cs="Arial" w:eastAsia="Arial" w:hAnsi="Arial"/>
+          <w:color w:val="110663"/>
           <w:sz w:val="21"/>
           <w:szCs w:val="21"/>
         </w:rPr>
@@ -564,15 +656,17 @@
       <w:r>
         <w:rPr>
           <w:rFonts w:ascii="Arial" w:cs="Arial" w:eastAsia="Arial" w:hAnsi="Arial"/>
-          <w:sz w:val="21"/>
-          <w:szCs w:val="21"/>
-          <w:highlight w:val="yellow"/>
+          <w:color w:val="4C39CA"/>
+          <w:sz w:val="21"/>
+          <w:szCs w:val="21"/>
+          <w:shd w:fill="E6E0FB" w:color="auto" w:val="clear"/>
         </w:rPr>
         <w:t xml:space="preserve">[Vælg: nettoomsætningen ekskl. moms, fragt og rabatter / dækningsbidraget, dvs. salgspris minus kostpris for de solgte varer og ydelser / den første års kontraktværdi]</w:t>
       </w:r>
       <w:r>
         <w:rPr>
           <w:rFonts w:ascii="Arial" w:cs="Arial" w:eastAsia="Arial" w:hAnsi="Arial"/>
+          <w:color w:val="110663"/>
           <w:sz w:val="21"/>
           <w:szCs w:val="21"/>
         </w:rPr>
@@ -590,6 +684,9 @@
       <w:r>
         <w:rPr>
           <w:rFonts w:ascii="Arial" w:cs="Arial" w:eastAsia="Arial" w:hAnsi="Arial"/>
+          <w:b/>
+          <w:bCs/>
+          <w:color w:val="4C39CA"/>
           <w:sz w:val="21"/>
           <w:szCs w:val="21"/>
         </w:rPr>
@@ -604,6 +701,7 @@
       <w:r>
         <w:rPr>
           <w:rFonts w:ascii="Arial" w:cs="Arial" w:eastAsia="Arial" w:hAnsi="Arial"/>
+          <w:color w:val="110663"/>
           <w:sz w:val="21"/>
           <w:szCs w:val="21"/>
         </w:rPr>
@@ -612,15 +710,17 @@
       <w:r>
         <w:rPr>
           <w:rFonts w:ascii="Arial" w:cs="Arial" w:eastAsia="Arial" w:hAnsi="Arial"/>
-          <w:sz w:val="21"/>
-          <w:szCs w:val="21"/>
-          <w:highlight w:val="yellow"/>
+          <w:color w:val="4C39CA"/>
+          <w:sz w:val="21"/>
+          <w:szCs w:val="21"/>
+          <w:shd w:fill="E6E0FB" w:color="auto" w:val="clear"/>
         </w:rPr>
         <w:t xml:space="preserve">[fx salg til koncernforbundne selskaber, gratis prøveperioder, kreditnotaer, fornyelser af eksisterende aftaler]</w:t>
       </w:r>
       <w:r>
         <w:rPr>
           <w:rFonts w:ascii="Arial" w:cs="Arial" w:eastAsia="Arial" w:hAnsi="Arial"/>
+          <w:color w:val="110663"/>
           <w:sz w:val="21"/>
           <w:szCs w:val="21"/>
         </w:rPr>
@@ -638,6 +738,9 @@
       <w:r>
         <w:rPr>
           <w:rFonts w:ascii="Arial" w:cs="Arial" w:eastAsia="Arial" w:hAnsi="Arial"/>
+          <w:b/>
+          <w:bCs/>
+          <w:color w:val="4C39CA"/>
           <w:sz w:val="21"/>
           <w:szCs w:val="21"/>
         </w:rPr>
@@ -652,6 +755,7 @@
       <w:r>
         <w:rPr>
           <w:rFonts w:ascii="Arial" w:cs="Arial" w:eastAsia="Arial" w:hAnsi="Arial"/>
+          <w:color w:val="110663"/>
           <w:sz w:val="21"/>
           <w:szCs w:val="21"/>
         </w:rPr>
@@ -660,15 +764,17 @@
       <w:r>
         <w:rPr>
           <w:rFonts w:ascii="Arial" w:cs="Arial" w:eastAsia="Arial" w:hAnsi="Arial"/>
-          <w:sz w:val="21"/>
-          <w:szCs w:val="21"/>
-          <w:highlight w:val="yellow"/>
+          <w:color w:val="4C39CA"/>
+          <w:sz w:val="21"/>
+          <w:szCs w:val="21"/>
+          <w:shd w:fill="E6E0FB" w:color="auto" w:val="clear"/>
         </w:rPr>
         <w:t xml:space="preserve">[Vælg: med lige store andele / efter en fordeling, som salgschefen fastlægger skriftligt, før salget lukkes]</w:t>
       </w:r>
       <w:r>
         <w:rPr>
           <w:rFonts w:ascii="Arial" w:cs="Arial" w:eastAsia="Arial" w:hAnsi="Arial"/>
+          <w:color w:val="110663"/>
           <w:sz w:val="21"/>
           <w:szCs w:val="21"/>
         </w:rPr>
@@ -678,10 +784,14 @@
     <w:p>
       <w:pPr>
         <w:pBdr>
-          <w:left w:val="single" w:color="BFBFBF" w:sz="12" w:space="8"/>
+          <w:top w:val="single" w:color="F4F1FE" w:sz="4" w:space="6"/>
+          <w:left w:val="single" w:color="F4F1FE" w:sz="4" w:space="6"/>
+          <w:bottom w:val="single" w:color="F4F1FE" w:sz="4" w:space="6"/>
+          <w:right w:val="single" w:color="F4F1FE" w:sz="4" w:space="6"/>
         </w:pBdr>
-        <w:spacing w:after="160" w:line="264"/>
-        <w:ind w:left="567"/>
+        <w:shd w:fill="F4F1FE" w:color="auto" w:val="clear"/>
+        <w:spacing w:after="220" w:before="120" w:line="264"/>
+        <w:ind w:left="687" w:right="120"/>
       </w:pPr>
       <w:r>
         <w:rPr>
@@ -690,7 +800,7 @@
           <w:bCs/>
           <w:i/>
           <w:iCs/>
-          <w:color w:val="595959"/>
+          <w:color w:val="4C39CA"/>
           <w:sz w:val="19"/>
           <w:szCs w:val="19"/>
         </w:rPr>
@@ -701,7 +811,7 @@
           <w:rFonts w:ascii="Arial" w:cs="Arial" w:eastAsia="Arial" w:hAnsi="Arial"/>
           <w:i/>
           <w:iCs/>
-          <w:color w:val="595959"/>
+          <w:color w:val="4A4775"/>
           <w:sz w:val="19"/>
           <w:szCs w:val="19"/>
         </w:rPr>
@@ -712,16 +822,16 @@
       <w:pPr>
         <w:pStyle w:val="Heading2"/>
         <w:keepNext/>
-        <w:spacing w:after="120" w:before="280"/>
-      </w:pPr>
-      <w:r>
-        <w:rPr>
-          <w:rFonts w:ascii="Arial" w:cs="Arial" w:eastAsia="Arial" w:hAnsi="Arial"/>
-          <w:b/>
-          <w:bCs/>
-          <w:color w:val="1F2A44"/>
-          <w:sz w:val="24"/>
-          <w:szCs w:val="24"/>
+        <w:spacing w:after="140" w:before="400"/>
+      </w:pPr>
+      <w:r>
+        <w:rPr>
+          <w:rFonts w:ascii="Arial" w:cs="Arial" w:eastAsia="Arial" w:hAnsi="Arial"/>
+          <w:b w:val="false"/>
+          <w:bCs w:val="false"/>
+          <w:color w:val="110663"/>
+          <w:sz w:val="30"/>
+          <w:szCs w:val="30"/>
         </w:rPr>
         <w:t xml:space="preserve">3. Hvornår et salg tæller</w:t>
       </w:r>
@@ -737,6 +847,9 @@
       <w:r>
         <w:rPr>
           <w:rFonts w:ascii="Arial" w:cs="Arial" w:eastAsia="Arial" w:hAnsi="Arial"/>
+          <w:b/>
+          <w:bCs/>
+          <w:color w:val="4C39CA"/>
           <w:sz w:val="21"/>
           <w:szCs w:val="21"/>
         </w:rPr>
@@ -751,6 +864,7 @@
       <w:r>
         <w:rPr>
           <w:rFonts w:ascii="Arial" w:cs="Arial" w:eastAsia="Arial" w:hAnsi="Arial"/>
+          <w:color w:val="110663"/>
           <w:sz w:val="21"/>
           <w:szCs w:val="21"/>
         </w:rPr>
@@ -759,15 +873,17 @@
       <w:r>
         <w:rPr>
           <w:rFonts w:ascii="Arial" w:cs="Arial" w:eastAsia="Arial" w:hAnsi="Arial"/>
-          <w:sz w:val="21"/>
-          <w:szCs w:val="21"/>
-          <w:highlight w:val="yellow"/>
+          <w:color w:val="4C39CA"/>
+          <w:sz w:val="21"/>
+          <w:szCs w:val="21"/>
+          <w:shd w:fill="E6E0FB" w:color="auto" w:val="clear"/>
         </w:rPr>
         <w:t xml:space="preserve">[Vælg: kunden har underskrevet aftalen / kunden er faktureret / kunden har betalt fakturaen]</w:t>
       </w:r>
       <w:r>
         <w:rPr>
           <w:rFonts w:ascii="Arial" w:cs="Arial" w:eastAsia="Arial" w:hAnsi="Arial"/>
+          <w:color w:val="110663"/>
           <w:sz w:val="21"/>
           <w:szCs w:val="21"/>
         </w:rPr>
@@ -785,6 +901,9 @@
       <w:r>
         <w:rPr>
           <w:rFonts w:ascii="Arial" w:cs="Arial" w:eastAsia="Arial" w:hAnsi="Arial"/>
+          <w:b/>
+          <w:bCs/>
+          <w:color w:val="4C39CA"/>
           <w:sz w:val="21"/>
           <w:szCs w:val="21"/>
         </w:rPr>
@@ -799,6 +918,7 @@
       <w:r>
         <w:rPr>
           <w:rFonts w:ascii="Arial" w:cs="Arial" w:eastAsia="Arial" w:hAnsi="Arial"/>
+          <w:color w:val="110663"/>
           <w:sz w:val="21"/>
           <w:szCs w:val="21"/>
         </w:rPr>
@@ -807,15 +927,17 @@
       <w:r>
         <w:rPr>
           <w:rFonts w:ascii="Arial" w:cs="Arial" w:eastAsia="Arial" w:hAnsi="Arial"/>
-          <w:sz w:val="21"/>
-          <w:szCs w:val="21"/>
-          <w:highlight w:val="yellow"/>
+          <w:color w:val="4C39CA"/>
+          <w:sz w:val="21"/>
+          <w:szCs w:val="21"/>
+          <w:shd w:fill="E6E0FB" w:color="auto" w:val="clear"/>
         </w:rPr>
         <w:t xml:space="preserve">[CRM-system / økonomisystem]</w:t>
       </w:r>
       <w:r>
         <w:rPr>
           <w:rFonts w:ascii="Arial" w:cs="Arial" w:eastAsia="Arial" w:hAnsi="Arial"/>
+          <w:color w:val="110663"/>
           <w:sz w:val="21"/>
           <w:szCs w:val="21"/>
         </w:rPr>
@@ -825,10 +947,14 @@
     <w:p>
       <w:pPr>
         <w:pBdr>
-          <w:left w:val="single" w:color="BFBFBF" w:sz="12" w:space="8"/>
+          <w:top w:val="single" w:color="F4F1FE" w:sz="4" w:space="6"/>
+          <w:left w:val="single" w:color="F4F1FE" w:sz="4" w:space="6"/>
+          <w:bottom w:val="single" w:color="F4F1FE" w:sz="4" w:space="6"/>
+          <w:right w:val="single" w:color="F4F1FE" w:sz="4" w:space="6"/>
         </w:pBdr>
-        <w:spacing w:after="160" w:line="264"/>
-        <w:ind w:left="567"/>
+        <w:shd w:fill="F4F1FE" w:color="auto" w:val="clear"/>
+        <w:spacing w:after="220" w:before="120" w:line="264"/>
+        <w:ind w:left="687" w:right="120"/>
       </w:pPr>
       <w:r>
         <w:rPr>
@@ -837,7 +963,7 @@
           <w:bCs/>
           <w:i/>
           <w:iCs/>
-          <w:color w:val="595959"/>
+          <w:color w:val="4C39CA"/>
           <w:sz w:val="19"/>
           <w:szCs w:val="19"/>
         </w:rPr>
@@ -848,7 +974,7 @@
           <w:rFonts w:ascii="Arial" w:cs="Arial" w:eastAsia="Arial" w:hAnsi="Arial"/>
           <w:i/>
           <w:iCs/>
-          <w:color w:val="595959"/>
+          <w:color w:val="4A4775"/>
           <w:sz w:val="19"/>
           <w:szCs w:val="19"/>
         </w:rPr>
@@ -859,16 +985,16 @@
       <w:pPr>
         <w:pStyle w:val="Heading2"/>
         <w:keepNext/>
-        <w:spacing w:after="120" w:before="280"/>
-      </w:pPr>
-      <w:r>
-        <w:rPr>
-          <w:rFonts w:ascii="Arial" w:cs="Arial" w:eastAsia="Arial" w:hAnsi="Arial"/>
-          <w:b/>
-          <w:bCs/>
-          <w:color w:val="1F2A44"/>
-          <w:sz w:val="24"/>
-          <w:szCs w:val="24"/>
+        <w:spacing w:after="140" w:before="400"/>
+      </w:pPr>
+      <w:r>
+        <w:rPr>
+          <w:rFonts w:ascii="Arial" w:cs="Arial" w:eastAsia="Arial" w:hAnsi="Arial"/>
+          <w:b w:val="false"/>
+          <w:bCs w:val="false"/>
+          <w:color w:val="110663"/>
+          <w:sz w:val="30"/>
+          <w:szCs w:val="30"/>
         </w:rPr>
         <w:t xml:space="preserve">4. Satser og provisionsmodel</w:t>
       </w:r>
@@ -884,6 +1010,9 @@
       <w:r>
         <w:rPr>
           <w:rFonts w:ascii="Arial" w:cs="Arial" w:eastAsia="Arial" w:hAnsi="Arial"/>
+          <w:b/>
+          <w:bCs/>
+          <w:color w:val="4C39CA"/>
           <w:sz w:val="21"/>
           <w:szCs w:val="21"/>
         </w:rPr>
@@ -898,6 +1027,7 @@
       <w:r>
         <w:rPr>
           <w:rFonts w:ascii="Arial" w:cs="Arial" w:eastAsia="Arial" w:hAnsi="Arial"/>
+          <w:color w:val="110663"/>
           <w:sz w:val="21"/>
           <w:szCs w:val="21"/>
         </w:rPr>
@@ -906,15 +1036,17 @@
       <w:r>
         <w:rPr>
           <w:rFonts w:ascii="Arial" w:cs="Arial" w:eastAsia="Arial" w:hAnsi="Arial"/>
-          <w:sz w:val="21"/>
-          <w:szCs w:val="21"/>
-          <w:highlight w:val="yellow"/>
+          <w:color w:val="4C39CA"/>
+          <w:sz w:val="21"/>
+          <w:szCs w:val="21"/>
+          <w:shd w:fill="E6E0FB" w:color="auto" w:val="clear"/>
         </w:rPr>
         <w:t xml:space="preserve">[Vælg: fast sats / trappemodel / accelerator over kvote]</w:t>
       </w:r>
       <w:r>
         <w:rPr>
           <w:rFonts w:ascii="Arial" w:cs="Arial" w:eastAsia="Arial" w:hAnsi="Arial"/>
+          <w:color w:val="110663"/>
           <w:sz w:val="21"/>
           <w:szCs w:val="21"/>
         </w:rPr>
@@ -932,6 +1064,9 @@
       <w:r>
         <w:rPr>
           <w:rFonts w:ascii="Arial" w:cs="Arial" w:eastAsia="Arial" w:hAnsi="Arial"/>
+          <w:b/>
+          <w:bCs/>
+          <w:color w:val="4C39CA"/>
           <w:sz w:val="21"/>
           <w:szCs w:val="21"/>
         </w:rPr>
@@ -946,6 +1081,7 @@
       <w:r>
         <w:rPr>
           <w:rFonts w:ascii="Arial" w:cs="Arial" w:eastAsia="Arial" w:hAnsi="Arial"/>
+          <w:color w:val="110663"/>
           <w:sz w:val="21"/>
           <w:szCs w:val="21"/>
         </w:rPr>
@@ -961,12 +1097,12 @@
       <w:tblPr>
         <w:tblW w:type="dxa" w:w="9026"/>
         <w:tblBorders>
-          <w:top w:val="single" w:color="auto" w:sz="4"/>
-          <w:left w:val="single" w:color="auto" w:sz="4"/>
-          <w:bottom w:val="single" w:color="auto" w:sz="4"/>
-          <w:right w:val="single" w:color="auto" w:sz="4"/>
-          <w:insideH w:val="single" w:color="auto" w:sz="4"/>
-          <w:insideV w:val="single" w:color="auto" w:sz="4"/>
+          <w:top w:val="single" w:color="D9D5EA" w:sz="2"/>
+          <w:left w:val="single" w:color="D9D5EA" w:sz="2"/>
+          <w:bottom w:val="single" w:color="D9D5EA" w:sz="2"/>
+          <w:right w:val="single" w:color="D9D5EA" w:sz="2"/>
+          <w:insideH w:val="single" w:color="D9D5EA" w:sz="2"/>
+          <w:insideV w:val="single" w:color="D9D5EA" w:sz="2"/>
         </w:tblBorders>
       </w:tblPr>
       <w:tblGrid>
@@ -982,17 +1118,17 @@
           <w:tcPr>
             <w:tcW w:type="dxa" w:w="2600"/>
             <w:tcBorders>
-              <w:top w:val="single" w:color="BFBFBF" w:sz="4"/>
-              <w:left w:val="single" w:color="BFBFBF" w:sz="4"/>
-              <w:bottom w:val="single" w:color="BFBFBF" w:sz="4"/>
-              <w:right w:val="single" w:color="BFBFBF" w:sz="4"/>
+              <w:top w:val="single" w:color="D9D5EA" w:sz="2"/>
+              <w:left w:val="single" w:color="D9D5EA" w:sz="2"/>
+              <w:bottom w:val="single" w:color="D9D5EA" w:sz="2"/>
+              <w:right w:val="single" w:color="D9D5EA" w:sz="2"/>
             </w:tcBorders>
-            <w:shd w:fill="DDE3EE" w:color="auto" w:val="clear"/>
+            <w:shd w:fill="F4F1FE" w:color="auto" w:val="clear"/>
             <w:tcMar>
-              <w:top w:type="dxa" w:w="60"/>
-              <w:left w:type="dxa" w:w="100"/>
-              <w:bottom w:type="dxa" w:w="60"/>
-              <w:right w:type="dxa" w:w="100"/>
+              <w:top w:type="dxa" w:w="80"/>
+              <w:left w:type="dxa" w:w="120"/>
+              <w:bottom w:type="dxa" w:w="80"/>
+              <w:right w:type="dxa" w:w="120"/>
             </w:tcMar>
           </w:tcPr>
           <w:p>
@@ -1004,6 +1140,7 @@
                 <w:rFonts w:ascii="Arial" w:cs="Arial" w:eastAsia="Arial" w:hAnsi="Arial"/>
                 <w:b/>
                 <w:bCs/>
+                <w:color w:val="110663"/>
                 <w:sz w:val="19"/>
                 <w:szCs w:val="19"/>
               </w:rPr>
@@ -1015,17 +1152,17 @@
           <w:tcPr>
             <w:tcW w:type="dxa" w:w="3926"/>
             <w:tcBorders>
-              <w:top w:val="single" w:color="BFBFBF" w:sz="4"/>
-              <w:left w:val="single" w:color="BFBFBF" w:sz="4"/>
-              <w:bottom w:val="single" w:color="BFBFBF" w:sz="4"/>
-              <w:right w:val="single" w:color="BFBFBF" w:sz="4"/>
+              <w:top w:val="single" w:color="D9D5EA" w:sz="2"/>
+              <w:left w:val="single" w:color="D9D5EA" w:sz="2"/>
+              <w:bottom w:val="single" w:color="D9D5EA" w:sz="2"/>
+              <w:right w:val="single" w:color="D9D5EA" w:sz="2"/>
             </w:tcBorders>
-            <w:shd w:fill="DDE3EE" w:color="auto" w:val="clear"/>
+            <w:shd w:fill="F4F1FE" w:color="auto" w:val="clear"/>
             <w:tcMar>
-              <w:top w:type="dxa" w:w="60"/>
-              <w:left w:type="dxa" w:w="100"/>
-              <w:bottom w:type="dxa" w:w="60"/>
-              <w:right w:type="dxa" w:w="100"/>
+              <w:top w:type="dxa" w:w="80"/>
+              <w:left w:type="dxa" w:w="120"/>
+              <w:bottom w:type="dxa" w:w="80"/>
+              <w:right w:type="dxa" w:w="120"/>
             </w:tcMar>
           </w:tcPr>
           <w:p>
@@ -1037,6 +1174,7 @@
                 <w:rFonts w:ascii="Arial" w:cs="Arial" w:eastAsia="Arial" w:hAnsi="Arial"/>
                 <w:b/>
                 <w:bCs/>
+                <w:color w:val="110663"/>
                 <w:sz w:val="19"/>
                 <w:szCs w:val="19"/>
               </w:rPr>
@@ -1047,9 +1185,10 @@
                 <w:rFonts w:ascii="Arial" w:cs="Arial" w:eastAsia="Arial" w:hAnsi="Arial"/>
                 <w:b/>
                 <w:bCs/>
+                <w:color w:val="4C39CA"/>
                 <w:sz w:val="19"/>
                 <w:szCs w:val="19"/>
-                <w:highlight w:val="yellow"/>
+                <w:shd w:fill="E6E0FB" w:color="auto" w:val="clear"/>
               </w:rPr>
               <w:t xml:space="preserve">[måned]</w:t>
             </w:r>
@@ -1059,17 +1198,17 @@
           <w:tcPr>
             <w:tcW w:type="dxa" w:w="2500"/>
             <w:tcBorders>
-              <w:top w:val="single" w:color="BFBFBF" w:sz="4"/>
-              <w:left w:val="single" w:color="BFBFBF" w:sz="4"/>
-              <w:bottom w:val="single" w:color="BFBFBF" w:sz="4"/>
-              <w:right w:val="single" w:color="BFBFBF" w:sz="4"/>
+              <w:top w:val="single" w:color="D9D5EA" w:sz="2"/>
+              <w:left w:val="single" w:color="D9D5EA" w:sz="2"/>
+              <w:bottom w:val="single" w:color="D9D5EA" w:sz="2"/>
+              <w:right w:val="single" w:color="D9D5EA" w:sz="2"/>
             </w:tcBorders>
-            <w:shd w:fill="DDE3EE" w:color="auto" w:val="clear"/>
+            <w:shd w:fill="F4F1FE" w:color="auto" w:val="clear"/>
             <w:tcMar>
-              <w:top w:type="dxa" w:w="60"/>
-              <w:left w:type="dxa" w:w="100"/>
-              <w:bottom w:type="dxa" w:w="60"/>
-              <w:right w:type="dxa" w:w="100"/>
+              <w:top w:type="dxa" w:w="80"/>
+              <w:left w:type="dxa" w:w="120"/>
+              <w:bottom w:type="dxa" w:w="80"/>
+              <w:right w:type="dxa" w:w="120"/>
             </w:tcMar>
           </w:tcPr>
           <w:p>
@@ -1081,6 +1220,7 @@
                 <w:rFonts w:ascii="Arial" w:cs="Arial" w:eastAsia="Arial" w:hAnsi="Arial"/>
                 <w:b/>
                 <w:bCs/>
+                <w:color w:val="110663"/>
                 <w:sz w:val="19"/>
                 <w:szCs w:val="19"/>
               </w:rPr>
@@ -1097,16 +1237,16 @@
           <w:tcPr>
             <w:tcW w:type="dxa" w:w="2600"/>
             <w:tcBorders>
-              <w:top w:val="single" w:color="BFBFBF" w:sz="4"/>
-              <w:left w:val="single" w:color="BFBFBF" w:sz="4"/>
-              <w:bottom w:val="single" w:color="BFBFBF" w:sz="4"/>
-              <w:right w:val="single" w:color="BFBFBF" w:sz="4"/>
+              <w:top w:val="single" w:color="D9D5EA" w:sz="2"/>
+              <w:left w:val="single" w:color="D9D5EA" w:sz="2"/>
+              <w:bottom w:val="single" w:color="D9D5EA" w:sz="2"/>
+              <w:right w:val="single" w:color="D9D5EA" w:sz="2"/>
             </w:tcBorders>
             <w:tcMar>
-              <w:top w:type="dxa" w:w="60"/>
-              <w:left w:type="dxa" w:w="100"/>
-              <w:bottom w:type="dxa" w:w="60"/>
-              <w:right w:type="dxa" w:w="100"/>
+              <w:top w:type="dxa" w:w="80"/>
+              <w:left w:type="dxa" w:w="120"/>
+              <w:bottom w:type="dxa" w:w="80"/>
+              <w:right w:type="dxa" w:w="120"/>
             </w:tcMar>
           </w:tcPr>
           <w:p>
@@ -1118,6 +1258,7 @@
                 <w:rFonts w:ascii="Arial" w:cs="Arial" w:eastAsia="Arial" w:hAnsi="Arial"/>
                 <w:b w:val="false"/>
                 <w:bCs w:val="false"/>
+                <w:color w:val="110663"/>
                 <w:sz w:val="19"/>
                 <w:szCs w:val="19"/>
               </w:rPr>
@@ -1129,16 +1270,16 @@
           <w:tcPr>
             <w:tcW w:type="dxa" w:w="3926"/>
             <w:tcBorders>
-              <w:top w:val="single" w:color="BFBFBF" w:sz="4"/>
-              <w:left w:val="single" w:color="BFBFBF" w:sz="4"/>
-              <w:bottom w:val="single" w:color="BFBFBF" w:sz="4"/>
-              <w:right w:val="single" w:color="BFBFBF" w:sz="4"/>
+              <w:top w:val="single" w:color="D9D5EA" w:sz="2"/>
+              <w:left w:val="single" w:color="D9D5EA" w:sz="2"/>
+              <w:bottom w:val="single" w:color="D9D5EA" w:sz="2"/>
+              <w:right w:val="single" w:color="D9D5EA" w:sz="2"/>
             </w:tcBorders>
             <w:tcMar>
-              <w:top w:type="dxa" w:w="60"/>
-              <w:left w:type="dxa" w:w="100"/>
-              <w:bottom w:type="dxa" w:w="60"/>
-              <w:right w:type="dxa" w:w="100"/>
+              <w:top w:type="dxa" w:w="80"/>
+              <w:left w:type="dxa" w:w="120"/>
+              <w:bottom w:type="dxa" w:w="80"/>
+              <w:right w:type="dxa" w:w="120"/>
             </w:tcMar>
           </w:tcPr>
           <w:p>
@@ -1150,9 +1291,10 @@
                 <w:rFonts w:ascii="Arial" w:cs="Arial" w:eastAsia="Arial" w:hAnsi="Arial"/>
                 <w:b w:val="false"/>
                 <w:bCs w:val="false"/>
+                <w:color w:val="4C39CA"/>
                 <w:sz w:val="19"/>
                 <w:szCs w:val="19"/>
-                <w:highlight w:val="yellow"/>
+                <w:shd w:fill="E6E0FB" w:color="auto" w:val="clear"/>
               </w:rPr>
               <w:t xml:space="preserve">[0]</w:t>
             </w:r>
@@ -1161,6 +1303,7 @@
                 <w:rFonts w:ascii="Arial" w:cs="Arial" w:eastAsia="Arial" w:hAnsi="Arial"/>
                 <w:b w:val="false"/>
                 <w:bCs w:val="false"/>
+                <w:color w:val="110663"/>
                 <w:sz w:val="19"/>
                 <w:szCs w:val="19"/>
               </w:rPr>
@@ -1171,9 +1314,10 @@
                 <w:rFonts w:ascii="Arial" w:cs="Arial" w:eastAsia="Arial" w:hAnsi="Arial"/>
                 <w:b w:val="false"/>
                 <w:bCs w:val="false"/>
+                <w:color w:val="4C39CA"/>
                 <w:sz w:val="19"/>
                 <w:szCs w:val="19"/>
-                <w:highlight w:val="yellow"/>
+                <w:shd w:fill="E6E0FB" w:color="auto" w:val="clear"/>
               </w:rPr>
               <w:t xml:space="preserve">[150.000]</w:t>
             </w:r>
@@ -1182,6 +1326,7 @@
                 <w:rFonts w:ascii="Arial" w:cs="Arial" w:eastAsia="Arial" w:hAnsi="Arial"/>
                 <w:b w:val="false"/>
                 <w:bCs w:val="false"/>
+                <w:color w:val="110663"/>
                 <w:sz w:val="19"/>
                 <w:szCs w:val="19"/>
               </w:rPr>
@@ -1193,16 +1338,16 @@
           <w:tcPr>
             <w:tcW w:type="dxa" w:w="2500"/>
             <w:tcBorders>
-              <w:top w:val="single" w:color="BFBFBF" w:sz="4"/>
-              <w:left w:val="single" w:color="BFBFBF" w:sz="4"/>
-              <w:bottom w:val="single" w:color="BFBFBF" w:sz="4"/>
-              <w:right w:val="single" w:color="BFBFBF" w:sz="4"/>
+              <w:top w:val="single" w:color="D9D5EA" w:sz="2"/>
+              <w:left w:val="single" w:color="D9D5EA" w:sz="2"/>
+              <w:bottom w:val="single" w:color="D9D5EA" w:sz="2"/>
+              <w:right w:val="single" w:color="D9D5EA" w:sz="2"/>
             </w:tcBorders>
             <w:tcMar>
-              <w:top w:type="dxa" w:w="60"/>
-              <w:left w:type="dxa" w:w="100"/>
-              <w:bottom w:type="dxa" w:w="60"/>
-              <w:right w:type="dxa" w:w="100"/>
+              <w:top w:type="dxa" w:w="80"/>
+              <w:left w:type="dxa" w:w="120"/>
+              <w:bottom w:type="dxa" w:w="80"/>
+              <w:right w:type="dxa" w:w="120"/>
             </w:tcMar>
           </w:tcPr>
           <w:p>
@@ -1214,9 +1359,10 @@
                 <w:rFonts w:ascii="Arial" w:cs="Arial" w:eastAsia="Arial" w:hAnsi="Arial"/>
                 <w:b w:val="false"/>
                 <w:bCs w:val="false"/>
+                <w:color w:val="4C39CA"/>
                 <w:sz w:val="19"/>
                 <w:szCs w:val="19"/>
-                <w:highlight w:val="yellow"/>
+                <w:shd w:fill="E6E0FB" w:color="auto" w:val="clear"/>
               </w:rPr>
               <w:t xml:space="preserve">[4]</w:t>
             </w:r>
@@ -1225,6 +1371,7 @@
                 <w:rFonts w:ascii="Arial" w:cs="Arial" w:eastAsia="Arial" w:hAnsi="Arial"/>
                 <w:b w:val="false"/>
                 <w:bCs w:val="false"/>
+                <w:color w:val="110663"/>
                 <w:sz w:val="19"/>
                 <w:szCs w:val="19"/>
               </w:rPr>
@@ -1241,16 +1388,16 @@
           <w:tcPr>
             <w:tcW w:type="dxa" w:w="2600"/>
             <w:tcBorders>
-              <w:top w:val="single" w:color="BFBFBF" w:sz="4"/>
-              <w:left w:val="single" w:color="BFBFBF" w:sz="4"/>
-              <w:bottom w:val="single" w:color="BFBFBF" w:sz="4"/>
-              <w:right w:val="single" w:color="BFBFBF" w:sz="4"/>
+              <w:top w:val="single" w:color="D9D5EA" w:sz="2"/>
+              <w:left w:val="single" w:color="D9D5EA" w:sz="2"/>
+              <w:bottom w:val="single" w:color="D9D5EA" w:sz="2"/>
+              <w:right w:val="single" w:color="D9D5EA" w:sz="2"/>
             </w:tcBorders>
             <w:tcMar>
-              <w:top w:type="dxa" w:w="60"/>
-              <w:left w:type="dxa" w:w="100"/>
-              <w:bottom w:type="dxa" w:w="60"/>
-              <w:right w:type="dxa" w:w="100"/>
+              <w:top w:type="dxa" w:w="80"/>
+              <w:left w:type="dxa" w:w="120"/>
+              <w:bottom w:type="dxa" w:w="80"/>
+              <w:right w:type="dxa" w:w="120"/>
             </w:tcMar>
           </w:tcPr>
           <w:p>
@@ -1262,6 +1409,7 @@
                 <w:rFonts w:ascii="Arial" w:cs="Arial" w:eastAsia="Arial" w:hAnsi="Arial"/>
                 <w:b w:val="false"/>
                 <w:bCs w:val="false"/>
+                <w:color w:val="110663"/>
                 <w:sz w:val="19"/>
                 <w:szCs w:val="19"/>
               </w:rPr>
@@ -1273,16 +1421,16 @@
           <w:tcPr>
             <w:tcW w:type="dxa" w:w="3926"/>
             <w:tcBorders>
-              <w:top w:val="single" w:color="BFBFBF" w:sz="4"/>
-              <w:left w:val="single" w:color="BFBFBF" w:sz="4"/>
-              <w:bottom w:val="single" w:color="BFBFBF" w:sz="4"/>
-              <w:right w:val="single" w:color="BFBFBF" w:sz="4"/>
+              <w:top w:val="single" w:color="D9D5EA" w:sz="2"/>
+              <w:left w:val="single" w:color="D9D5EA" w:sz="2"/>
+              <w:bottom w:val="single" w:color="D9D5EA" w:sz="2"/>
+              <w:right w:val="single" w:color="D9D5EA" w:sz="2"/>
             </w:tcBorders>
             <w:tcMar>
-              <w:top w:type="dxa" w:w="60"/>
-              <w:left w:type="dxa" w:w="100"/>
-              <w:bottom w:type="dxa" w:w="60"/>
-              <w:right w:type="dxa" w:w="100"/>
+              <w:top w:type="dxa" w:w="80"/>
+              <w:left w:type="dxa" w:w="120"/>
+              <w:bottom w:type="dxa" w:w="80"/>
+              <w:right w:type="dxa" w:w="120"/>
             </w:tcMar>
           </w:tcPr>
           <w:p>
@@ -1294,6 +1442,7 @@
                 <w:rFonts w:ascii="Arial" w:cs="Arial" w:eastAsia="Arial" w:hAnsi="Arial"/>
                 <w:b w:val="false"/>
                 <w:bCs w:val="false"/>
+                <w:color w:val="110663"/>
                 <w:sz w:val="19"/>
                 <w:szCs w:val="19"/>
               </w:rPr>
@@ -1304,9 +1453,10 @@
                 <w:rFonts w:ascii="Arial" w:cs="Arial" w:eastAsia="Arial" w:hAnsi="Arial"/>
                 <w:b w:val="false"/>
                 <w:bCs w:val="false"/>
+                <w:color w:val="4C39CA"/>
                 <w:sz w:val="19"/>
                 <w:szCs w:val="19"/>
-                <w:highlight w:val="yellow"/>
+                <w:shd w:fill="E6E0FB" w:color="auto" w:val="clear"/>
               </w:rPr>
               <w:t xml:space="preserve">[150.000]</w:t>
             </w:r>
@@ -1315,6 +1465,7 @@
                 <w:rFonts w:ascii="Arial" w:cs="Arial" w:eastAsia="Arial" w:hAnsi="Arial"/>
                 <w:b w:val="false"/>
                 <w:bCs w:val="false"/>
+                <w:color w:val="110663"/>
                 <w:sz w:val="19"/>
                 <w:szCs w:val="19"/>
               </w:rPr>
@@ -1325,9 +1476,10 @@
                 <w:rFonts w:ascii="Arial" w:cs="Arial" w:eastAsia="Arial" w:hAnsi="Arial"/>
                 <w:b w:val="false"/>
                 <w:bCs w:val="false"/>
+                <w:color w:val="4C39CA"/>
                 <w:sz w:val="19"/>
                 <w:szCs w:val="19"/>
-                <w:highlight w:val="yellow"/>
+                <w:shd w:fill="E6E0FB" w:color="auto" w:val="clear"/>
               </w:rPr>
               <w:t xml:space="preserve">[300.000]</w:t>
             </w:r>
@@ -1336,6 +1488,7 @@
                 <w:rFonts w:ascii="Arial" w:cs="Arial" w:eastAsia="Arial" w:hAnsi="Arial"/>
                 <w:b w:val="false"/>
                 <w:bCs w:val="false"/>
+                <w:color w:val="110663"/>
                 <w:sz w:val="19"/>
                 <w:szCs w:val="19"/>
               </w:rPr>
@@ -1347,16 +1500,16 @@
           <w:tcPr>
             <w:tcW w:type="dxa" w:w="2500"/>
             <w:tcBorders>
-              <w:top w:val="single" w:color="BFBFBF" w:sz="4"/>
-              <w:left w:val="single" w:color="BFBFBF" w:sz="4"/>
-              <w:bottom w:val="single" w:color="BFBFBF" w:sz="4"/>
-              <w:right w:val="single" w:color="BFBFBF" w:sz="4"/>
+              <w:top w:val="single" w:color="D9D5EA" w:sz="2"/>
+              <w:left w:val="single" w:color="D9D5EA" w:sz="2"/>
+              <w:bottom w:val="single" w:color="D9D5EA" w:sz="2"/>
+              <w:right w:val="single" w:color="D9D5EA" w:sz="2"/>
             </w:tcBorders>
             <w:tcMar>
-              <w:top w:type="dxa" w:w="60"/>
-              <w:left w:type="dxa" w:w="100"/>
-              <w:bottom w:type="dxa" w:w="60"/>
-              <w:right w:type="dxa" w:w="100"/>
+              <w:top w:type="dxa" w:w="80"/>
+              <w:left w:type="dxa" w:w="120"/>
+              <w:bottom w:type="dxa" w:w="80"/>
+              <w:right w:type="dxa" w:w="120"/>
             </w:tcMar>
           </w:tcPr>
           <w:p>
@@ -1368,9 +1521,10 @@
                 <w:rFonts w:ascii="Arial" w:cs="Arial" w:eastAsia="Arial" w:hAnsi="Arial"/>
                 <w:b w:val="false"/>
                 <w:bCs w:val="false"/>
+                <w:color w:val="4C39CA"/>
                 <w:sz w:val="19"/>
                 <w:szCs w:val="19"/>
-                <w:highlight w:val="yellow"/>
+                <w:shd w:fill="E6E0FB" w:color="auto" w:val="clear"/>
               </w:rPr>
               <w:t xml:space="preserve">[7]</w:t>
             </w:r>
@@ -1379,6 +1533,7 @@
                 <w:rFonts w:ascii="Arial" w:cs="Arial" w:eastAsia="Arial" w:hAnsi="Arial"/>
                 <w:b w:val="false"/>
                 <w:bCs w:val="false"/>
+                <w:color w:val="110663"/>
                 <w:sz w:val="19"/>
                 <w:szCs w:val="19"/>
               </w:rPr>
@@ -1395,16 +1550,16 @@
           <w:tcPr>
             <w:tcW w:type="dxa" w:w="2600"/>
             <w:tcBorders>
-              <w:top w:val="single" w:color="BFBFBF" w:sz="4"/>
-              <w:left w:val="single" w:color="BFBFBF" w:sz="4"/>
-              <w:bottom w:val="single" w:color="BFBFBF" w:sz="4"/>
-              <w:right w:val="single" w:color="BFBFBF" w:sz="4"/>
+              <w:top w:val="single" w:color="D9D5EA" w:sz="2"/>
+              <w:left w:val="single" w:color="D9D5EA" w:sz="2"/>
+              <w:bottom w:val="single" w:color="D9D5EA" w:sz="2"/>
+              <w:right w:val="single" w:color="D9D5EA" w:sz="2"/>
             </w:tcBorders>
             <w:tcMar>
-              <w:top w:type="dxa" w:w="60"/>
-              <w:left w:type="dxa" w:w="100"/>
-              <w:bottom w:type="dxa" w:w="60"/>
-              <w:right w:type="dxa" w:w="100"/>
+              <w:top w:type="dxa" w:w="80"/>
+              <w:left w:type="dxa" w:w="120"/>
+              <w:bottom w:type="dxa" w:w="80"/>
+              <w:right w:type="dxa" w:w="120"/>
             </w:tcMar>
           </w:tcPr>
           <w:p>
@@ -1416,6 +1571,7 @@
                 <w:rFonts w:ascii="Arial" w:cs="Arial" w:eastAsia="Arial" w:hAnsi="Arial"/>
                 <w:b w:val="false"/>
                 <w:bCs w:val="false"/>
+                <w:color w:val="110663"/>
                 <w:sz w:val="19"/>
                 <w:szCs w:val="19"/>
               </w:rPr>
@@ -1427,16 +1583,16 @@
           <w:tcPr>
             <w:tcW w:type="dxa" w:w="3926"/>
             <w:tcBorders>
-              <w:top w:val="single" w:color="BFBFBF" w:sz="4"/>
-              <w:left w:val="single" w:color="BFBFBF" w:sz="4"/>
-              <w:bottom w:val="single" w:color="BFBFBF" w:sz="4"/>
-              <w:right w:val="single" w:color="BFBFBF" w:sz="4"/>
+              <w:top w:val="single" w:color="D9D5EA" w:sz="2"/>
+              <w:left w:val="single" w:color="D9D5EA" w:sz="2"/>
+              <w:bottom w:val="single" w:color="D9D5EA" w:sz="2"/>
+              <w:right w:val="single" w:color="D9D5EA" w:sz="2"/>
             </w:tcBorders>
             <w:tcMar>
-              <w:top w:type="dxa" w:w="60"/>
-              <w:left w:type="dxa" w:w="100"/>
-              <w:bottom w:type="dxa" w:w="60"/>
-              <w:right w:type="dxa" w:w="100"/>
+              <w:top w:type="dxa" w:w="80"/>
+              <w:left w:type="dxa" w:w="120"/>
+              <w:bottom w:type="dxa" w:w="80"/>
+              <w:right w:type="dxa" w:w="120"/>
             </w:tcMar>
           </w:tcPr>
           <w:p>
@@ -1448,6 +1604,7 @@
                 <w:rFonts w:ascii="Arial" w:cs="Arial" w:eastAsia="Arial" w:hAnsi="Arial"/>
                 <w:b w:val="false"/>
                 <w:bCs w:val="false"/>
+                <w:color w:val="110663"/>
                 <w:sz w:val="19"/>
                 <w:szCs w:val="19"/>
               </w:rPr>
@@ -1458,9 +1615,10 @@
                 <w:rFonts w:ascii="Arial" w:cs="Arial" w:eastAsia="Arial" w:hAnsi="Arial"/>
                 <w:b w:val="false"/>
                 <w:bCs w:val="false"/>
+                <w:color w:val="4C39CA"/>
                 <w:sz w:val="19"/>
                 <w:szCs w:val="19"/>
-                <w:highlight w:val="yellow"/>
+                <w:shd w:fill="E6E0FB" w:color="auto" w:val="clear"/>
               </w:rPr>
               <w:t xml:space="preserve">[300.000]</w:t>
             </w:r>
@@ -1469,6 +1627,7 @@
                 <w:rFonts w:ascii="Arial" w:cs="Arial" w:eastAsia="Arial" w:hAnsi="Arial"/>
                 <w:b w:val="false"/>
                 <w:bCs w:val="false"/>
+                <w:color w:val="110663"/>
                 <w:sz w:val="19"/>
                 <w:szCs w:val="19"/>
               </w:rPr>
@@ -1480,16 +1639,16 @@
           <w:tcPr>
             <w:tcW w:type="dxa" w:w="2500"/>
             <w:tcBorders>
-              <w:top w:val="single" w:color="BFBFBF" w:sz="4"/>
-              <w:left w:val="single" w:color="BFBFBF" w:sz="4"/>
-              <w:bottom w:val="single" w:color="BFBFBF" w:sz="4"/>
-              <w:right w:val="single" w:color="BFBFBF" w:sz="4"/>
+              <w:top w:val="single" w:color="D9D5EA" w:sz="2"/>
+              <w:left w:val="single" w:color="D9D5EA" w:sz="2"/>
+              <w:bottom w:val="single" w:color="D9D5EA" w:sz="2"/>
+              <w:right w:val="single" w:color="D9D5EA" w:sz="2"/>
             </w:tcBorders>
             <w:tcMar>
-              <w:top w:type="dxa" w:w="60"/>
-              <w:left w:type="dxa" w:w="100"/>
-              <w:bottom w:type="dxa" w:w="60"/>
-              <w:right w:type="dxa" w:w="100"/>
+              <w:top w:type="dxa" w:w="80"/>
+              <w:left w:type="dxa" w:w="120"/>
+              <w:bottom w:type="dxa" w:w="80"/>
+              <w:right w:type="dxa" w:w="120"/>
             </w:tcMar>
           </w:tcPr>
           <w:p>
@@ -1501,9 +1660,10 @@
                 <w:rFonts w:ascii="Arial" w:cs="Arial" w:eastAsia="Arial" w:hAnsi="Arial"/>
                 <w:b w:val="false"/>
                 <w:bCs w:val="false"/>
+                <w:color w:val="4C39CA"/>
                 <w:sz w:val="19"/>
                 <w:szCs w:val="19"/>
-                <w:highlight w:val="yellow"/>
+                <w:shd w:fill="E6E0FB" w:color="auto" w:val="clear"/>
               </w:rPr>
               <w:t xml:space="preserve">[10]</w:t>
             </w:r>
@@ -1512,6 +1672,7 @@
                 <w:rFonts w:ascii="Arial" w:cs="Arial" w:eastAsia="Arial" w:hAnsi="Arial"/>
                 <w:b w:val="false"/>
                 <w:bCs w:val="false"/>
+                <w:color w:val="110663"/>
                 <w:sz w:val="19"/>
                 <w:szCs w:val="19"/>
               </w:rPr>
@@ -1528,16 +1689,16 @@
           <w:tcPr>
             <w:tcW w:type="dxa" w:w="2600"/>
             <w:tcBorders>
-              <w:top w:val="single" w:color="BFBFBF" w:sz="4"/>
-              <w:left w:val="single" w:color="BFBFBF" w:sz="4"/>
-              <w:bottom w:val="single" w:color="BFBFBF" w:sz="4"/>
-              <w:right w:val="single" w:color="BFBFBF" w:sz="4"/>
+              <w:top w:val="single" w:color="D9D5EA" w:sz="2"/>
+              <w:left w:val="single" w:color="D9D5EA" w:sz="2"/>
+              <w:bottom w:val="single" w:color="D9D5EA" w:sz="2"/>
+              <w:right w:val="single" w:color="D9D5EA" w:sz="2"/>
             </w:tcBorders>
             <w:tcMar>
-              <w:top w:type="dxa" w:w="60"/>
-              <w:left w:type="dxa" w:w="100"/>
-              <w:bottom w:type="dxa" w:w="60"/>
-              <w:right w:type="dxa" w:w="100"/>
+              <w:top w:type="dxa" w:w="80"/>
+              <w:left w:type="dxa" w:w="120"/>
+              <w:bottom w:type="dxa" w:w="80"/>
+              <w:right w:type="dxa" w:w="120"/>
             </w:tcMar>
           </w:tcPr>
           <w:p>
@@ -1549,6 +1710,7 @@
                 <w:rFonts w:ascii="Arial" w:cs="Arial" w:eastAsia="Arial" w:hAnsi="Arial"/>
                 <w:b w:val="false"/>
                 <w:bCs w:val="false"/>
+                <w:color w:val="110663"/>
                 <w:sz w:val="19"/>
                 <w:szCs w:val="19"/>
               </w:rPr>
@@ -1560,16 +1722,16 @@
           <w:tcPr>
             <w:tcW w:type="dxa" w:w="3926"/>
             <w:tcBorders>
-              <w:top w:val="single" w:color="BFBFBF" w:sz="4"/>
-              <w:left w:val="single" w:color="BFBFBF" w:sz="4"/>
-              <w:bottom w:val="single" w:color="BFBFBF" w:sz="4"/>
-              <w:right w:val="single" w:color="BFBFBF" w:sz="4"/>
+              <w:top w:val="single" w:color="D9D5EA" w:sz="2"/>
+              <w:left w:val="single" w:color="D9D5EA" w:sz="2"/>
+              <w:bottom w:val="single" w:color="D9D5EA" w:sz="2"/>
+              <w:right w:val="single" w:color="D9D5EA" w:sz="2"/>
             </w:tcBorders>
             <w:tcMar>
-              <w:top w:type="dxa" w:w="60"/>
-              <w:left w:type="dxa" w:w="100"/>
-              <w:bottom w:type="dxa" w:w="60"/>
-              <w:right w:type="dxa" w:w="100"/>
+              <w:top w:type="dxa" w:w="80"/>
+              <w:left w:type="dxa" w:w="120"/>
+              <w:bottom w:type="dxa" w:w="80"/>
+              <w:right w:type="dxa" w:w="120"/>
             </w:tcMar>
           </w:tcPr>
           <w:p>
@@ -1581,6 +1743,7 @@
                 <w:rFonts w:ascii="Arial" w:cs="Arial" w:eastAsia="Arial" w:hAnsi="Arial"/>
                 <w:b w:val="false"/>
                 <w:bCs w:val="false"/>
+                <w:color w:val="110663"/>
                 <w:sz w:val="19"/>
                 <w:szCs w:val="19"/>
               </w:rPr>
@@ -1592,16 +1755,16 @@
           <w:tcPr>
             <w:tcW w:type="dxa" w:w="2500"/>
             <w:tcBorders>
-              <w:top w:val="single" w:color="BFBFBF" w:sz="4"/>
-              <w:left w:val="single" w:color="BFBFBF" w:sz="4"/>
-              <w:bottom w:val="single" w:color="BFBFBF" w:sz="4"/>
-              <w:right w:val="single" w:color="BFBFBF" w:sz="4"/>
+              <w:top w:val="single" w:color="D9D5EA" w:sz="2"/>
+              <w:left w:val="single" w:color="D9D5EA" w:sz="2"/>
+              <w:bottom w:val="single" w:color="D9D5EA" w:sz="2"/>
+              <w:right w:val="single" w:color="D9D5EA" w:sz="2"/>
             </w:tcBorders>
             <w:tcMar>
-              <w:top w:type="dxa" w:w="60"/>
-              <w:left w:type="dxa" w:w="100"/>
-              <w:bottom w:type="dxa" w:w="60"/>
-              <w:right w:type="dxa" w:w="100"/>
+              <w:top w:type="dxa" w:w="80"/>
+              <w:left w:type="dxa" w:w="120"/>
+              <w:bottom w:type="dxa" w:w="80"/>
+              <w:right w:type="dxa" w:w="120"/>
             </w:tcMar>
           </w:tcPr>
           <w:p>
@@ -1613,9 +1776,10 @@
                 <w:rFonts w:ascii="Arial" w:cs="Arial" w:eastAsia="Arial" w:hAnsi="Arial"/>
                 <w:b w:val="false"/>
                 <w:bCs w:val="false"/>
+                <w:color w:val="4C39CA"/>
                 <w:sz w:val="19"/>
                 <w:szCs w:val="19"/>
-                <w:highlight w:val="yellow"/>
+                <w:shd w:fill="E6E0FB" w:color="auto" w:val="clear"/>
               </w:rPr>
               <w:t xml:space="preserve">[25.000]</w:t>
             </w:r>
@@ -1624,6 +1788,7 @@
                 <w:rFonts w:ascii="Arial" w:cs="Arial" w:eastAsia="Arial" w:hAnsi="Arial"/>
                 <w:b w:val="false"/>
                 <w:bCs w:val="false"/>
+                <w:color w:val="110663"/>
                 <w:sz w:val="19"/>
                 <w:szCs w:val="19"/>
               </w:rPr>
@@ -1634,9 +1799,10 @@
                 <w:rFonts w:ascii="Arial" w:cs="Arial" w:eastAsia="Arial" w:hAnsi="Arial"/>
                 <w:b w:val="false"/>
                 <w:bCs w:val="false"/>
+                <w:color w:val="4C39CA"/>
                 <w:sz w:val="19"/>
                 <w:szCs w:val="19"/>
-                <w:highlight w:val="yellow"/>
+                <w:shd w:fill="E6E0FB" w:color="auto" w:val="clear"/>
               </w:rPr>
               <w:t xml:space="preserve">[måned]</w:t>
             </w:r>
@@ -1658,6 +1824,7 @@
           <w:rFonts w:ascii="Arial" w:cs="Arial" w:eastAsia="Arial" w:hAnsi="Arial"/>
           <w:i w:val="false"/>
           <w:iCs w:val="false"/>
+          <w:color w:val="110663"/>
           <w:sz w:val="21"/>
           <w:szCs w:val="21"/>
         </w:rPr>
@@ -1675,6 +1842,9 @@
       <w:r>
         <w:rPr>
           <w:rFonts w:ascii="Arial" w:cs="Arial" w:eastAsia="Arial" w:hAnsi="Arial"/>
+          <w:b/>
+          <w:bCs/>
+          <w:color w:val="4C39CA"/>
           <w:sz w:val="21"/>
           <w:szCs w:val="21"/>
         </w:rPr>
@@ -1689,15 +1859,17 @@
       <w:r>
         <w:rPr>
           <w:rFonts w:ascii="Arial" w:cs="Arial" w:eastAsia="Arial" w:hAnsi="Arial"/>
-          <w:sz w:val="21"/>
-          <w:szCs w:val="21"/>
-          <w:highlight w:val="yellow"/>
+          <w:color w:val="4C39CA"/>
+          <w:sz w:val="21"/>
+          <w:szCs w:val="21"/>
+          <w:shd w:fill="E6E0FB" w:color="auto" w:val="clear"/>
         </w:rPr>
         <w:t xml:space="preserve">[Hvis fast sats:]</w:t>
       </w:r>
       <w:r>
         <w:rPr>
           <w:rFonts w:ascii="Arial" w:cs="Arial" w:eastAsia="Arial" w:hAnsi="Arial"/>
+          <w:color w:val="110663"/>
           <w:sz w:val="21"/>
           <w:szCs w:val="21"/>
         </w:rPr>
@@ -1706,15 +1878,17 @@
       <w:r>
         <w:rPr>
           <w:rFonts w:ascii="Arial" w:cs="Arial" w:eastAsia="Arial" w:hAnsi="Arial"/>
-          <w:sz w:val="21"/>
-          <w:szCs w:val="21"/>
-          <w:highlight w:val="yellow"/>
+          <w:color w:val="4C39CA"/>
+          <w:sz w:val="21"/>
+          <w:szCs w:val="21"/>
+          <w:shd w:fill="E6E0FB" w:color="auto" w:val="clear"/>
         </w:rPr>
         <w:t xml:space="preserve">[6]</w:t>
       </w:r>
       <w:r>
         <w:rPr>
           <w:rFonts w:ascii="Arial" w:cs="Arial" w:eastAsia="Arial" w:hAnsi="Arial"/>
+          <w:color w:val="110663"/>
           <w:sz w:val="21"/>
           <w:szCs w:val="21"/>
         </w:rPr>
@@ -1723,15 +1897,17 @@
       <w:r>
         <w:rPr>
           <w:rFonts w:ascii="Arial" w:cs="Arial" w:eastAsia="Arial" w:hAnsi="Arial"/>
-          <w:sz w:val="21"/>
-          <w:szCs w:val="21"/>
-          <w:highlight w:val="yellow"/>
+          <w:color w:val="4C39CA"/>
+          <w:sz w:val="21"/>
+          <w:szCs w:val="21"/>
+          <w:shd w:fill="E6E0FB" w:color="auto" w:val="clear"/>
         </w:rPr>
         <w:t xml:space="preserve">[Hvis accelerator:]</w:t>
       </w:r>
       <w:r>
         <w:rPr>
           <w:rFonts w:ascii="Arial" w:cs="Arial" w:eastAsia="Arial" w:hAnsi="Arial"/>
+          <w:color w:val="110663"/>
           <w:sz w:val="21"/>
           <w:szCs w:val="21"/>
         </w:rPr>
@@ -1740,15 +1916,17 @@
       <w:r>
         <w:rPr>
           <w:rFonts w:ascii="Arial" w:cs="Arial" w:eastAsia="Arial" w:hAnsi="Arial"/>
-          <w:sz w:val="21"/>
-          <w:szCs w:val="21"/>
-          <w:highlight w:val="yellow"/>
+          <w:color w:val="4C39CA"/>
+          <w:sz w:val="21"/>
+          <w:szCs w:val="21"/>
+          <w:shd w:fill="E6E0FB" w:color="auto" w:val="clear"/>
         </w:rPr>
         <w:t xml:space="preserve">[15]</w:t>
       </w:r>
       <w:r>
         <w:rPr>
           <w:rFonts w:ascii="Arial" w:cs="Arial" w:eastAsia="Arial" w:hAnsi="Arial"/>
+          <w:color w:val="110663"/>
           <w:sz w:val="21"/>
           <w:szCs w:val="21"/>
         </w:rPr>
@@ -1757,15 +1935,17 @@
       <w:r>
         <w:rPr>
           <w:rFonts w:ascii="Arial" w:cs="Arial" w:eastAsia="Arial" w:hAnsi="Arial"/>
-          <w:sz w:val="21"/>
-          <w:szCs w:val="21"/>
-          <w:highlight w:val="yellow"/>
+          <w:color w:val="4C39CA"/>
+          <w:sz w:val="21"/>
+          <w:szCs w:val="21"/>
+          <w:shd w:fill="E6E0FB" w:color="auto" w:val="clear"/>
         </w:rPr>
         <w:t xml:space="preserve">[25]</w:t>
       </w:r>
       <w:r>
         <w:rPr>
           <w:rFonts w:ascii="Arial" w:cs="Arial" w:eastAsia="Arial" w:hAnsi="Arial"/>
+          <w:color w:val="110663"/>
           <w:sz w:val="21"/>
           <w:szCs w:val="21"/>
         </w:rPr>
@@ -1783,6 +1963,9 @@
       <w:r>
         <w:rPr>
           <w:rFonts w:ascii="Arial" w:cs="Arial" w:eastAsia="Arial" w:hAnsi="Arial"/>
+          <w:b/>
+          <w:bCs/>
+          <w:color w:val="4C39CA"/>
           <w:sz w:val="21"/>
           <w:szCs w:val="21"/>
         </w:rPr>
@@ -1797,6 +1980,7 @@
       <w:r>
         <w:rPr>
           <w:rFonts w:ascii="Arial" w:cs="Arial" w:eastAsia="Arial" w:hAnsi="Arial"/>
+          <w:color w:val="110663"/>
           <w:sz w:val="21"/>
           <w:szCs w:val="21"/>
         </w:rPr>
@@ -1806,10 +1990,14 @@
     <w:p>
       <w:pPr>
         <w:pBdr>
-          <w:left w:val="single" w:color="BFBFBF" w:sz="12" w:space="8"/>
+          <w:top w:val="single" w:color="F4F1FE" w:sz="4" w:space="6"/>
+          <w:left w:val="single" w:color="F4F1FE" w:sz="4" w:space="6"/>
+          <w:bottom w:val="single" w:color="F4F1FE" w:sz="4" w:space="6"/>
+          <w:right w:val="single" w:color="F4F1FE" w:sz="4" w:space="6"/>
         </w:pBdr>
-        <w:spacing w:after="160" w:line="264"/>
-        <w:ind w:left="567"/>
+        <w:shd w:fill="F4F1FE" w:color="auto" w:val="clear"/>
+        <w:spacing w:after="220" w:before="120" w:line="264"/>
+        <w:ind w:left="687" w:right="120"/>
       </w:pPr>
       <w:r>
         <w:rPr>
@@ -1818,7 +2006,7 @@
           <w:bCs/>
           <w:i/>
           <w:iCs/>
-          <w:color w:val="595959"/>
+          <w:color w:val="4C39CA"/>
           <w:sz w:val="19"/>
           <w:szCs w:val="19"/>
         </w:rPr>
@@ -1829,7 +2017,7 @@
           <w:rFonts w:ascii="Arial" w:cs="Arial" w:eastAsia="Arial" w:hAnsi="Arial"/>
           <w:i/>
           <w:iCs/>
-          <w:color w:val="595959"/>
+          <w:color w:val="4A4775"/>
           <w:sz w:val="19"/>
           <w:szCs w:val="19"/>
         </w:rPr>
@@ -1840,16 +2028,16 @@
       <w:pPr>
         <w:pStyle w:val="Heading2"/>
         <w:keepNext/>
-        <w:spacing w:after="120" w:before="280"/>
-      </w:pPr>
-      <w:r>
-        <w:rPr>
-          <w:rFonts w:ascii="Arial" w:cs="Arial" w:eastAsia="Arial" w:hAnsi="Arial"/>
-          <w:b/>
-          <w:bCs/>
-          <w:color w:val="1F2A44"/>
-          <w:sz w:val="24"/>
-          <w:szCs w:val="24"/>
+        <w:spacing w:after="140" w:before="400"/>
+      </w:pPr>
+      <w:r>
+        <w:rPr>
+          <w:rFonts w:ascii="Arial" w:cs="Arial" w:eastAsia="Arial" w:hAnsi="Arial"/>
+          <w:b w:val="false"/>
+          <w:bCs w:val="false"/>
+          <w:color w:val="110663"/>
+          <w:sz w:val="30"/>
+          <w:szCs w:val="30"/>
         </w:rPr>
         <w:t xml:space="preserve">5. Kvote og periode</w:t>
       </w:r>
@@ -1865,6 +2053,9 @@
       <w:r>
         <w:rPr>
           <w:rFonts w:ascii="Arial" w:cs="Arial" w:eastAsia="Arial" w:hAnsi="Arial"/>
+          <w:b/>
+          <w:bCs/>
+          <w:color w:val="4C39CA"/>
           <w:sz w:val="21"/>
           <w:szCs w:val="21"/>
         </w:rPr>
@@ -1879,6 +2070,7 @@
       <w:r>
         <w:rPr>
           <w:rFonts w:ascii="Arial" w:cs="Arial" w:eastAsia="Arial" w:hAnsi="Arial"/>
+          <w:color w:val="110663"/>
           <w:sz w:val="21"/>
           <w:szCs w:val="21"/>
         </w:rPr>
@@ -1887,15 +2079,17 @@
       <w:r>
         <w:rPr>
           <w:rFonts w:ascii="Arial" w:cs="Arial" w:eastAsia="Arial" w:hAnsi="Arial"/>
-          <w:sz w:val="21"/>
-          <w:szCs w:val="21"/>
-          <w:highlight w:val="yellow"/>
+          <w:color w:val="4C39CA"/>
+          <w:sz w:val="21"/>
+          <w:szCs w:val="21"/>
+          <w:shd w:fill="E6E0FB" w:color="auto" w:val="clear"/>
         </w:rPr>
         <w:t xml:space="preserve">[Vælg: kalendermåneden / kvartalet / kalenderåret]</w:t>
       </w:r>
       <w:r>
         <w:rPr>
           <w:rFonts w:ascii="Arial" w:cs="Arial" w:eastAsia="Arial" w:hAnsi="Arial"/>
+          <w:color w:val="110663"/>
           <w:sz w:val="21"/>
           <w:szCs w:val="21"/>
         </w:rPr>
@@ -1913,6 +2107,9 @@
       <w:r>
         <w:rPr>
           <w:rFonts w:ascii="Arial" w:cs="Arial" w:eastAsia="Arial" w:hAnsi="Arial"/>
+          <w:b/>
+          <w:bCs/>
+          <w:color w:val="4C39CA"/>
           <w:sz w:val="21"/>
           <w:szCs w:val="21"/>
         </w:rPr>
@@ -1927,6 +2124,7 @@
       <w:r>
         <w:rPr>
           <w:rFonts w:ascii="Arial" w:cs="Arial" w:eastAsia="Arial" w:hAnsi="Arial"/>
+          <w:color w:val="110663"/>
           <w:sz w:val="21"/>
           <w:szCs w:val="21"/>
         </w:rPr>
@@ -1935,15 +2133,17 @@
       <w:r>
         <w:rPr>
           <w:rFonts w:ascii="Arial" w:cs="Arial" w:eastAsia="Arial" w:hAnsi="Arial"/>
-          <w:sz w:val="21"/>
-          <w:szCs w:val="21"/>
-          <w:highlight w:val="yellow"/>
+          <w:color w:val="4C39CA"/>
+          <w:sz w:val="21"/>
+          <w:szCs w:val="21"/>
+          <w:shd w:fill="E6E0FB" w:color="auto" w:val="clear"/>
         </w:rPr>
         <w:t xml:space="preserve">[beløb]</w:t>
       </w:r>
       <w:r>
         <w:rPr>
           <w:rFonts w:ascii="Arial" w:cs="Arial" w:eastAsia="Arial" w:hAnsi="Arial"/>
+          <w:color w:val="110663"/>
           <w:sz w:val="21"/>
           <w:szCs w:val="21"/>
         </w:rPr>
@@ -1952,15 +2152,17 @@
       <w:r>
         <w:rPr>
           <w:rFonts w:ascii="Arial" w:cs="Arial" w:eastAsia="Arial" w:hAnsi="Arial"/>
-          <w:sz w:val="21"/>
-          <w:szCs w:val="21"/>
-          <w:highlight w:val="yellow"/>
+          <w:color w:val="4C39CA"/>
+          <w:sz w:val="21"/>
+          <w:szCs w:val="21"/>
+          <w:shd w:fill="E6E0FB" w:color="auto" w:val="clear"/>
         </w:rPr>
         <w:t xml:space="preserve">[periode]</w:t>
       </w:r>
       <w:r>
         <w:rPr>
           <w:rFonts w:ascii="Arial" w:cs="Arial" w:eastAsia="Arial" w:hAnsi="Arial"/>
+          <w:color w:val="110663"/>
           <w:sz w:val="21"/>
           <w:szCs w:val="21"/>
         </w:rPr>
@@ -1969,15 +2171,17 @@
       <w:r>
         <w:rPr>
           <w:rFonts w:ascii="Arial" w:cs="Arial" w:eastAsia="Arial" w:hAnsi="Arial"/>
-          <w:sz w:val="21"/>
-          <w:szCs w:val="21"/>
-          <w:highlight w:val="yellow"/>
+          <w:color w:val="4C39CA"/>
+          <w:sz w:val="21"/>
+          <w:szCs w:val="21"/>
+          <w:shd w:fill="E6E0FB" w:color="auto" w:val="clear"/>
         </w:rPr>
         <w:t xml:space="preserve">[år]</w:t>
       </w:r>
       <w:r>
         <w:rPr>
           <w:rFonts w:ascii="Arial" w:cs="Arial" w:eastAsia="Arial" w:hAnsi="Arial"/>
+          <w:color w:val="110663"/>
           <w:sz w:val="21"/>
           <w:szCs w:val="21"/>
         </w:rPr>
@@ -1986,15 +2190,17 @@
       <w:r>
         <w:rPr>
           <w:rFonts w:ascii="Arial" w:cs="Arial" w:eastAsia="Arial" w:hAnsi="Arial"/>
-          <w:sz w:val="21"/>
-          <w:szCs w:val="21"/>
-          <w:highlight w:val="yellow"/>
+          <w:color w:val="4C39CA"/>
+          <w:sz w:val="21"/>
+          <w:szCs w:val="21"/>
+          <w:shd w:fill="E6E0FB" w:color="auto" w:val="clear"/>
         </w:rPr>
         <w:t xml:space="preserve">[dato]</w:t>
       </w:r>
       <w:r>
         <w:rPr>
           <w:rFonts w:ascii="Arial" w:cs="Arial" w:eastAsia="Arial" w:hAnsi="Arial"/>
+          <w:color w:val="110663"/>
           <w:sz w:val="21"/>
           <w:szCs w:val="21"/>
         </w:rPr>
@@ -2012,6 +2218,9 @@
       <w:r>
         <w:rPr>
           <w:rFonts w:ascii="Arial" w:cs="Arial" w:eastAsia="Arial" w:hAnsi="Arial"/>
+          <w:b/>
+          <w:bCs/>
+          <w:color w:val="4C39CA"/>
           <w:sz w:val="21"/>
           <w:szCs w:val="21"/>
         </w:rPr>
@@ -2026,6 +2235,7 @@
       <w:r>
         <w:rPr>
           <w:rFonts w:ascii="Arial" w:cs="Arial" w:eastAsia="Arial" w:hAnsi="Arial"/>
+          <w:color w:val="110663"/>
           <w:sz w:val="21"/>
           <w:szCs w:val="21"/>
         </w:rPr>
@@ -2034,15 +2244,17 @@
       <w:r>
         <w:rPr>
           <w:rFonts w:ascii="Arial" w:cs="Arial" w:eastAsia="Arial" w:hAnsi="Arial"/>
-          <w:sz w:val="21"/>
-          <w:szCs w:val="21"/>
-          <w:highlight w:val="yellow"/>
+          <w:color w:val="4C39CA"/>
+          <w:sz w:val="21"/>
+          <w:szCs w:val="21"/>
+          <w:shd w:fill="E6E0FB" w:color="auto" w:val="clear"/>
         </w:rPr>
         <w:t xml:space="preserve">[Vælg: nedsættes kvoten forholdsmæssigt / medregnes den skønnede provision i målopfyldelsen]</w:t>
       </w:r>
       <w:r>
         <w:rPr>
           <w:rFonts w:ascii="Arial" w:cs="Arial" w:eastAsia="Arial" w:hAnsi="Arial"/>
+          <w:color w:val="110663"/>
           <w:sz w:val="21"/>
           <w:szCs w:val="21"/>
         </w:rPr>
@@ -2052,10 +2264,14 @@
     <w:p>
       <w:pPr>
         <w:pBdr>
-          <w:left w:val="single" w:color="BFBFBF" w:sz="12" w:space="8"/>
+          <w:top w:val="single" w:color="F4F1FE" w:sz="4" w:space="6"/>
+          <w:left w:val="single" w:color="F4F1FE" w:sz="4" w:space="6"/>
+          <w:bottom w:val="single" w:color="F4F1FE" w:sz="4" w:space="6"/>
+          <w:right w:val="single" w:color="F4F1FE" w:sz="4" w:space="6"/>
         </w:pBdr>
-        <w:spacing w:after="160" w:line="264"/>
-        <w:ind w:left="567"/>
+        <w:shd w:fill="F4F1FE" w:color="auto" w:val="clear"/>
+        <w:spacing w:after="220" w:before="120" w:line="264"/>
+        <w:ind w:left="687" w:right="120"/>
       </w:pPr>
       <w:r>
         <w:rPr>
@@ -2064,7 +2280,7 @@
           <w:bCs/>
           <w:i/>
           <w:iCs/>
-          <w:color w:val="595959"/>
+          <w:color w:val="4C39CA"/>
           <w:sz w:val="19"/>
           <w:szCs w:val="19"/>
         </w:rPr>
@@ -2075,7 +2291,7 @@
           <w:rFonts w:ascii="Arial" w:cs="Arial" w:eastAsia="Arial" w:hAnsi="Arial"/>
           <w:i/>
           <w:iCs/>
-          <w:color w:val="595959"/>
+          <w:color w:val="4A4775"/>
           <w:sz w:val="19"/>
           <w:szCs w:val="19"/>
         </w:rPr>
@@ -2086,16 +2302,16 @@
       <w:pPr>
         <w:pStyle w:val="Heading2"/>
         <w:keepNext/>
-        <w:spacing w:after="120" w:before="280"/>
-      </w:pPr>
-      <w:r>
-        <w:rPr>
-          <w:rFonts w:ascii="Arial" w:cs="Arial" w:eastAsia="Arial" w:hAnsi="Arial"/>
-          <w:b/>
-          <w:bCs/>
-          <w:color w:val="1F2A44"/>
-          <w:sz w:val="24"/>
-          <w:szCs w:val="24"/>
+        <w:spacing w:after="140" w:before="400"/>
+      </w:pPr>
+      <w:r>
+        <w:rPr>
+          <w:rFonts w:ascii="Arial" w:cs="Arial" w:eastAsia="Arial" w:hAnsi="Arial"/>
+          <w:b w:val="false"/>
+          <w:bCs w:val="false"/>
+          <w:color w:val="110663"/>
+          <w:sz w:val="30"/>
+          <w:szCs w:val="30"/>
         </w:rPr>
         <w:t xml:space="preserve">6. Beregning og opgørelse</w:t>
       </w:r>
@@ -2111,6 +2327,9 @@
       <w:r>
         <w:rPr>
           <w:rFonts w:ascii="Arial" w:cs="Arial" w:eastAsia="Arial" w:hAnsi="Arial"/>
+          <w:b/>
+          <w:bCs/>
+          <w:color w:val="4C39CA"/>
           <w:sz w:val="21"/>
           <w:szCs w:val="21"/>
         </w:rPr>
@@ -2125,6 +2344,7 @@
       <w:r>
         <w:rPr>
           <w:rFonts w:ascii="Arial" w:cs="Arial" w:eastAsia="Arial" w:hAnsi="Arial"/>
+          <w:color w:val="110663"/>
           <w:sz w:val="21"/>
           <w:szCs w:val="21"/>
         </w:rPr>
@@ -2133,15 +2353,17 @@
       <w:r>
         <w:rPr>
           <w:rFonts w:ascii="Arial" w:cs="Arial" w:eastAsia="Arial" w:hAnsi="Arial"/>
-          <w:sz w:val="21"/>
-          <w:szCs w:val="21"/>
-          <w:highlight w:val="yellow"/>
+          <w:color w:val="4C39CA"/>
+          <w:sz w:val="21"/>
+          <w:szCs w:val="21"/>
+          <w:shd w:fill="E6E0FB" w:color="auto" w:val="clear"/>
         </w:rPr>
         <w:t xml:space="preserve">[månedligt]</w:t>
       </w:r>
       <w:r>
         <w:rPr>
           <w:rFonts w:ascii="Arial" w:cs="Arial" w:eastAsia="Arial" w:hAnsi="Arial"/>
+          <w:color w:val="110663"/>
           <w:sz w:val="21"/>
           <w:szCs w:val="21"/>
         </w:rPr>
@@ -2150,15 +2372,17 @@
       <w:r>
         <w:rPr>
           <w:rFonts w:ascii="Arial" w:cs="Arial" w:eastAsia="Arial" w:hAnsi="Arial"/>
-          <w:sz w:val="21"/>
-          <w:szCs w:val="21"/>
-          <w:highlight w:val="yellow"/>
+          <w:color w:val="4C39CA"/>
+          <w:sz w:val="21"/>
+          <w:szCs w:val="21"/>
+          <w:shd w:fill="E6E0FB" w:color="auto" w:val="clear"/>
         </w:rPr>
         <w:t xml:space="preserve">[system]</w:t>
       </w:r>
       <w:r>
         <w:rPr>
           <w:rFonts w:ascii="Arial" w:cs="Arial" w:eastAsia="Arial" w:hAnsi="Arial"/>
+          <w:color w:val="110663"/>
           <w:sz w:val="21"/>
           <w:szCs w:val="21"/>
         </w:rPr>
@@ -2176,6 +2400,9 @@
       <w:r>
         <w:rPr>
           <w:rFonts w:ascii="Arial" w:cs="Arial" w:eastAsia="Arial" w:hAnsi="Arial"/>
+          <w:b/>
+          <w:bCs/>
+          <w:color w:val="4C39CA"/>
           <w:sz w:val="21"/>
           <w:szCs w:val="21"/>
         </w:rPr>
@@ -2190,6 +2417,7 @@
       <w:r>
         <w:rPr>
           <w:rFonts w:ascii="Arial" w:cs="Arial" w:eastAsia="Arial" w:hAnsi="Arial"/>
+          <w:color w:val="110663"/>
           <w:sz w:val="21"/>
           <w:szCs w:val="21"/>
         </w:rPr>
@@ -2198,15 +2426,17 @@
       <w:r>
         <w:rPr>
           <w:rFonts w:ascii="Arial" w:cs="Arial" w:eastAsia="Arial" w:hAnsi="Arial"/>
-          <w:sz w:val="21"/>
-          <w:szCs w:val="21"/>
-          <w:highlight w:val="yellow"/>
+          <w:color w:val="4C39CA"/>
+          <w:sz w:val="21"/>
+          <w:szCs w:val="21"/>
+          <w:shd w:fill="E6E0FB" w:color="auto" w:val="clear"/>
         </w:rPr>
         <w:t xml:space="preserve">[den 5. hverdag]</w:t>
       </w:r>
       <w:r>
         <w:rPr>
           <w:rFonts w:ascii="Arial" w:cs="Arial" w:eastAsia="Arial" w:hAnsi="Arial"/>
+          <w:color w:val="110663"/>
           <w:sz w:val="21"/>
           <w:szCs w:val="21"/>
         </w:rPr>
@@ -2224,6 +2454,9 @@
       <w:r>
         <w:rPr>
           <w:rFonts w:ascii="Arial" w:cs="Arial" w:eastAsia="Arial" w:hAnsi="Arial"/>
+          <w:b/>
+          <w:bCs/>
+          <w:color w:val="4C39CA"/>
           <w:sz w:val="21"/>
           <w:szCs w:val="21"/>
         </w:rPr>
@@ -2238,6 +2471,7 @@
       <w:r>
         <w:rPr>
           <w:rFonts w:ascii="Arial" w:cs="Arial" w:eastAsia="Arial" w:hAnsi="Arial"/>
+          <w:color w:val="110663"/>
           <w:sz w:val="21"/>
           <w:szCs w:val="21"/>
         </w:rPr>
@@ -2246,15 +2480,17 @@
       <w:r>
         <w:rPr>
           <w:rFonts w:ascii="Arial" w:cs="Arial" w:eastAsia="Arial" w:hAnsi="Arial"/>
-          <w:sz w:val="21"/>
-          <w:szCs w:val="21"/>
-          <w:highlight w:val="yellow"/>
+          <w:color w:val="4C39CA"/>
+          <w:sz w:val="21"/>
+          <w:szCs w:val="21"/>
+          <w:shd w:fill="E6E0FB" w:color="auto" w:val="clear"/>
         </w:rPr>
         <w:t xml:space="preserve">[ordrer, fakturaer og CRM-data]</w:t>
       </w:r>
       <w:r>
         <w:rPr>
           <w:rFonts w:ascii="Arial" w:cs="Arial" w:eastAsia="Arial" w:hAnsi="Arial"/>
+          <w:color w:val="110663"/>
           <w:sz w:val="21"/>
           <w:szCs w:val="21"/>
         </w:rPr>
@@ -2272,6 +2508,9 @@
       <w:r>
         <w:rPr>
           <w:rFonts w:ascii="Arial" w:cs="Arial" w:eastAsia="Arial" w:hAnsi="Arial"/>
+          <w:b/>
+          <w:bCs/>
+          <w:color w:val="4C39CA"/>
           <w:sz w:val="21"/>
           <w:szCs w:val="21"/>
         </w:rPr>
@@ -2286,6 +2525,7 @@
       <w:r>
         <w:rPr>
           <w:rFonts w:ascii="Arial" w:cs="Arial" w:eastAsia="Arial" w:hAnsi="Arial"/>
+          <w:color w:val="110663"/>
           <w:sz w:val="21"/>
           <w:szCs w:val="21"/>
         </w:rPr>
@@ -2294,15 +2534,17 @@
       <w:r>
         <w:rPr>
           <w:rFonts w:ascii="Arial" w:cs="Arial" w:eastAsia="Arial" w:hAnsi="Arial"/>
-          <w:sz w:val="21"/>
-          <w:szCs w:val="21"/>
-          <w:highlight w:val="yellow"/>
+          <w:color w:val="4C39CA"/>
+          <w:sz w:val="21"/>
+          <w:szCs w:val="21"/>
+          <w:shd w:fill="E6E0FB" w:color="auto" w:val="clear"/>
         </w:rPr>
         <w:t xml:space="preserve">[nærmeste leder]</w:t>
       </w:r>
       <w:r>
         <w:rPr>
           <w:rFonts w:ascii="Arial" w:cs="Arial" w:eastAsia="Arial" w:hAnsi="Arial"/>
+          <w:color w:val="110663"/>
           <w:sz w:val="21"/>
           <w:szCs w:val="21"/>
         </w:rPr>
@@ -2311,15 +2553,17 @@
       <w:r>
         <w:rPr>
           <w:rFonts w:ascii="Arial" w:cs="Arial" w:eastAsia="Arial" w:hAnsi="Arial"/>
-          <w:sz w:val="21"/>
-          <w:szCs w:val="21"/>
-          <w:highlight w:val="yellow"/>
+          <w:color w:val="4C39CA"/>
+          <w:sz w:val="21"/>
+          <w:szCs w:val="21"/>
+          <w:shd w:fill="E6E0FB" w:color="auto" w:val="clear"/>
         </w:rPr>
         <w:t xml:space="preserve">[30]</w:t>
       </w:r>
       <w:r>
         <w:rPr>
           <w:rFonts w:ascii="Arial" w:cs="Arial" w:eastAsia="Arial" w:hAnsi="Arial"/>
+          <w:color w:val="110663"/>
           <w:sz w:val="21"/>
           <w:szCs w:val="21"/>
         </w:rPr>
@@ -2329,10 +2573,14 @@
     <w:p>
       <w:pPr>
         <w:pBdr>
-          <w:left w:val="single" w:color="BFBFBF" w:sz="12" w:space="8"/>
+          <w:top w:val="single" w:color="F4F1FE" w:sz="4" w:space="6"/>
+          <w:left w:val="single" w:color="F4F1FE" w:sz="4" w:space="6"/>
+          <w:bottom w:val="single" w:color="F4F1FE" w:sz="4" w:space="6"/>
+          <w:right w:val="single" w:color="F4F1FE" w:sz="4" w:space="6"/>
         </w:pBdr>
-        <w:spacing w:after="160" w:line="264"/>
-        <w:ind w:left="567"/>
+        <w:shd w:fill="F4F1FE" w:color="auto" w:val="clear"/>
+        <w:spacing w:after="220" w:before="120" w:line="264"/>
+        <w:ind w:left="687" w:right="120"/>
       </w:pPr>
       <w:r>
         <w:rPr>
@@ -2341,7 +2589,7 @@
           <w:bCs/>
           <w:i/>
           <w:iCs/>
-          <w:color w:val="595959"/>
+          <w:color w:val="4C39CA"/>
           <w:sz w:val="19"/>
           <w:szCs w:val="19"/>
         </w:rPr>
@@ -2352,7 +2600,7 @@
           <w:rFonts w:ascii="Arial" w:cs="Arial" w:eastAsia="Arial" w:hAnsi="Arial"/>
           <w:i/>
           <w:iCs/>
-          <w:color w:val="595959"/>
+          <w:color w:val="4A4775"/>
           <w:sz w:val="19"/>
           <w:szCs w:val="19"/>
         </w:rPr>
@@ -2363,16 +2611,16 @@
       <w:pPr>
         <w:pStyle w:val="Heading2"/>
         <w:keepNext/>
-        <w:spacing w:after="120" w:before="280"/>
-      </w:pPr>
-      <w:r>
-        <w:rPr>
-          <w:rFonts w:ascii="Arial" w:cs="Arial" w:eastAsia="Arial" w:hAnsi="Arial"/>
-          <w:b/>
-          <w:bCs/>
-          <w:color w:val="1F2A44"/>
-          <w:sz w:val="24"/>
-          <w:szCs w:val="24"/>
+        <w:spacing w:after="140" w:before="400"/>
+      </w:pPr>
+      <w:r>
+        <w:rPr>
+          <w:rFonts w:ascii="Arial" w:cs="Arial" w:eastAsia="Arial" w:hAnsi="Arial"/>
+          <w:b w:val="false"/>
+          <w:bCs w:val="false"/>
+          <w:color w:val="110663"/>
+          <w:sz w:val="30"/>
+          <w:szCs w:val="30"/>
         </w:rPr>
         <w:t xml:space="preserve">7. Udbetaling</w:t>
       </w:r>
@@ -2388,6 +2636,9 @@
       <w:r>
         <w:rPr>
           <w:rFonts w:ascii="Arial" w:cs="Arial" w:eastAsia="Arial" w:hAnsi="Arial"/>
+          <w:b/>
+          <w:bCs/>
+          <w:color w:val="4C39CA"/>
           <w:sz w:val="21"/>
           <w:szCs w:val="21"/>
         </w:rPr>
@@ -2402,6 +2653,7 @@
       <w:r>
         <w:rPr>
           <w:rFonts w:ascii="Arial" w:cs="Arial" w:eastAsia="Arial" w:hAnsi="Arial"/>
+          <w:color w:val="110663"/>
           <w:sz w:val="21"/>
           <w:szCs w:val="21"/>
         </w:rPr>
@@ -2410,15 +2662,17 @@
       <w:r>
         <w:rPr>
           <w:rFonts w:ascii="Arial" w:cs="Arial" w:eastAsia="Arial" w:hAnsi="Arial"/>
-          <w:sz w:val="21"/>
-          <w:szCs w:val="21"/>
-          <w:highlight w:val="yellow"/>
+          <w:color w:val="4C39CA"/>
+          <w:sz w:val="21"/>
+          <w:szCs w:val="21"/>
+          <w:shd w:fill="E6E0FB" w:color="auto" w:val="clear"/>
         </w:rPr>
         <w:t xml:space="preserve">[Vælg: den måned, hvor den er optjent / måneden efter optjeningen]</w:t>
       </w:r>
       <w:r>
         <w:rPr>
           <w:rFonts w:ascii="Arial" w:cs="Arial" w:eastAsia="Arial" w:hAnsi="Arial"/>
+          <w:color w:val="110663"/>
           <w:sz w:val="21"/>
           <w:szCs w:val="21"/>
         </w:rPr>
@@ -2436,6 +2690,9 @@
       <w:r>
         <w:rPr>
           <w:rFonts w:ascii="Arial" w:cs="Arial" w:eastAsia="Arial" w:hAnsi="Arial"/>
+          <w:b/>
+          <w:bCs/>
+          <w:color w:val="4C39CA"/>
           <w:sz w:val="21"/>
           <w:szCs w:val="21"/>
         </w:rPr>
@@ -2450,6 +2707,7 @@
       <w:r>
         <w:rPr>
           <w:rFonts w:ascii="Arial" w:cs="Arial" w:eastAsia="Arial" w:hAnsi="Arial"/>
+          <w:color w:val="110663"/>
           <w:sz w:val="21"/>
           <w:szCs w:val="21"/>
         </w:rPr>
@@ -2458,15 +2716,17 @@
       <w:r>
         <w:rPr>
           <w:rFonts w:ascii="Arial" w:cs="Arial" w:eastAsia="Arial" w:hAnsi="Arial"/>
-          <w:sz w:val="21"/>
-          <w:szCs w:val="21"/>
-          <w:highlight w:val="yellow"/>
+          <w:color w:val="4C39CA"/>
+          <w:sz w:val="21"/>
+          <w:szCs w:val="21"/>
+          <w:shd w:fill="E6E0FB" w:color="auto" w:val="clear"/>
         </w:rPr>
         <w:t xml:space="preserve">[Provisionen indgår / indgår ikke]</w:t>
       </w:r>
       <w:r>
         <w:rPr>
           <w:rFonts w:ascii="Arial" w:cs="Arial" w:eastAsia="Arial" w:hAnsi="Arial"/>
+          <w:color w:val="110663"/>
           <w:sz w:val="21"/>
           <w:szCs w:val="21"/>
         </w:rPr>
@@ -2476,10 +2736,14 @@
     <w:p>
       <w:pPr>
         <w:pBdr>
-          <w:left w:val="single" w:color="BFBFBF" w:sz="12" w:space="8"/>
+          <w:top w:val="single" w:color="F4F1FE" w:sz="4" w:space="6"/>
+          <w:left w:val="single" w:color="F4F1FE" w:sz="4" w:space="6"/>
+          <w:bottom w:val="single" w:color="F4F1FE" w:sz="4" w:space="6"/>
+          <w:right w:val="single" w:color="F4F1FE" w:sz="4" w:space="6"/>
         </w:pBdr>
-        <w:spacing w:after="160" w:line="264"/>
-        <w:ind w:left="567"/>
+        <w:shd w:fill="F4F1FE" w:color="auto" w:val="clear"/>
+        <w:spacing w:after="220" w:before="120" w:line="264"/>
+        <w:ind w:left="687" w:right="120"/>
       </w:pPr>
       <w:r>
         <w:rPr>
@@ -2488,7 +2752,7 @@
           <w:bCs/>
           <w:i/>
           <w:iCs/>
-          <w:color w:val="595959"/>
+          <w:color w:val="4C39CA"/>
           <w:sz w:val="19"/>
           <w:szCs w:val="19"/>
         </w:rPr>
@@ -2499,7 +2763,7 @@
           <w:rFonts w:ascii="Arial" w:cs="Arial" w:eastAsia="Arial" w:hAnsi="Arial"/>
           <w:i/>
           <w:iCs/>
-          <w:color w:val="595959"/>
+          <w:color w:val="4A4775"/>
           <w:sz w:val="19"/>
           <w:szCs w:val="19"/>
         </w:rPr>
@@ -2510,16 +2774,16 @@
       <w:pPr>
         <w:pStyle w:val="Heading2"/>
         <w:keepNext/>
-        <w:spacing w:after="120" w:before="280"/>
-      </w:pPr>
-      <w:r>
-        <w:rPr>
-          <w:rFonts w:ascii="Arial" w:cs="Arial" w:eastAsia="Arial" w:hAnsi="Arial"/>
-          <w:b/>
-          <w:bCs/>
-          <w:color w:val="1F2A44"/>
-          <w:sz w:val="24"/>
-          <w:szCs w:val="24"/>
+        <w:spacing w:after="140" w:before="400"/>
+      </w:pPr>
+      <w:r>
+        <w:rPr>
+          <w:rFonts w:ascii="Arial" w:cs="Arial" w:eastAsia="Arial" w:hAnsi="Arial"/>
+          <w:b w:val="false"/>
+          <w:bCs w:val="false"/>
+          <w:color w:val="110663"/>
+          <w:sz w:val="30"/>
+          <w:szCs w:val="30"/>
         </w:rPr>
         <w:t xml:space="preserve">8. Annullering og clawback</w:t>
       </w:r>
@@ -2535,6 +2799,9 @@
       <w:r>
         <w:rPr>
           <w:rFonts w:ascii="Arial" w:cs="Arial" w:eastAsia="Arial" w:hAnsi="Arial"/>
+          <w:b/>
+          <w:bCs/>
+          <w:color w:val="4C39CA"/>
           <w:sz w:val="21"/>
           <w:szCs w:val="21"/>
         </w:rPr>
@@ -2549,6 +2816,7 @@
       <w:r>
         <w:rPr>
           <w:rFonts w:ascii="Arial" w:cs="Arial" w:eastAsia="Arial" w:hAnsi="Arial"/>
+          <w:color w:val="110663"/>
           <w:sz w:val="21"/>
           <w:szCs w:val="21"/>
         </w:rPr>
@@ -2557,15 +2825,17 @@
       <w:r>
         <w:rPr>
           <w:rFonts w:ascii="Arial" w:cs="Arial" w:eastAsia="Arial" w:hAnsi="Arial"/>
-          <w:sz w:val="21"/>
-          <w:szCs w:val="21"/>
-          <w:highlight w:val="yellow"/>
+          <w:color w:val="4C39CA"/>
+          <w:sz w:val="21"/>
+          <w:szCs w:val="21"/>
+          <w:shd w:fill="E6E0FB" w:color="auto" w:val="clear"/>
         </w:rPr>
         <w:t xml:space="preserve">[3]</w:t>
       </w:r>
       <w:r>
         <w:rPr>
           <w:rFonts w:ascii="Arial" w:cs="Arial" w:eastAsia="Arial" w:hAnsi="Arial"/>
+          <w:color w:val="110663"/>
           <w:sz w:val="21"/>
           <w:szCs w:val="21"/>
         </w:rPr>
@@ -2583,6 +2853,9 @@
       <w:r>
         <w:rPr>
           <w:rFonts w:ascii="Arial" w:cs="Arial" w:eastAsia="Arial" w:hAnsi="Arial"/>
+          <w:b/>
+          <w:bCs/>
+          <w:color w:val="4C39CA"/>
           <w:sz w:val="21"/>
           <w:szCs w:val="21"/>
         </w:rPr>
@@ -2597,6 +2870,7 @@
       <w:r>
         <w:rPr>
           <w:rFonts w:ascii="Arial" w:cs="Arial" w:eastAsia="Arial" w:hAnsi="Arial"/>
+          <w:color w:val="110663"/>
           <w:sz w:val="21"/>
           <w:szCs w:val="21"/>
         </w:rPr>
@@ -2614,6 +2888,9 @@
       <w:r>
         <w:rPr>
           <w:rFonts w:ascii="Arial" w:cs="Arial" w:eastAsia="Arial" w:hAnsi="Arial"/>
+          <w:b/>
+          <w:bCs/>
+          <w:color w:val="4C39CA"/>
           <w:sz w:val="21"/>
           <w:szCs w:val="21"/>
         </w:rPr>
@@ -2628,6 +2905,7 @@
       <w:r>
         <w:rPr>
           <w:rFonts w:ascii="Arial" w:cs="Arial" w:eastAsia="Arial" w:hAnsi="Arial"/>
+          <w:color w:val="110663"/>
           <w:sz w:val="21"/>
           <w:szCs w:val="21"/>
         </w:rPr>
@@ -2636,15 +2914,17 @@
       <w:r>
         <w:rPr>
           <w:rFonts w:ascii="Arial" w:cs="Arial" w:eastAsia="Arial" w:hAnsi="Arial"/>
-          <w:sz w:val="21"/>
-          <w:szCs w:val="21"/>
-          <w:highlight w:val="yellow"/>
+          <w:color w:val="4C39CA"/>
+          <w:sz w:val="21"/>
+          <w:szCs w:val="21"/>
+          <w:shd w:fill="E6E0FB" w:color="auto" w:val="clear"/>
         </w:rPr>
         <w:t xml:space="preserve">[leveringssvigt eller ændrede priser]</w:t>
       </w:r>
       <w:r>
         <w:rPr>
           <w:rFonts w:ascii="Arial" w:cs="Arial" w:eastAsia="Arial" w:hAnsi="Arial"/>
+          <w:color w:val="110663"/>
           <w:sz w:val="21"/>
           <w:szCs w:val="21"/>
         </w:rPr>
@@ -2662,6 +2942,9 @@
       <w:r>
         <w:rPr>
           <w:rFonts w:ascii="Arial" w:cs="Arial" w:eastAsia="Arial" w:hAnsi="Arial"/>
+          <w:b/>
+          <w:bCs/>
+          <w:color w:val="4C39CA"/>
           <w:sz w:val="21"/>
           <w:szCs w:val="21"/>
         </w:rPr>
@@ -2676,15 +2959,17 @@
       <w:r>
         <w:rPr>
           <w:rFonts w:ascii="Arial" w:cs="Arial" w:eastAsia="Arial" w:hAnsi="Arial"/>
-          <w:sz w:val="21"/>
-          <w:szCs w:val="21"/>
-          <w:highlight w:val="yellow"/>
+          <w:color w:val="4C39CA"/>
+          <w:sz w:val="21"/>
+          <w:szCs w:val="21"/>
+          <w:shd w:fill="E6E0FB" w:color="auto" w:val="clear"/>
         </w:rPr>
         <w:t xml:space="preserve">[Hvis relevant:]</w:t>
       </w:r>
       <w:r>
         <w:rPr>
           <w:rFonts w:ascii="Arial" w:cs="Arial" w:eastAsia="Arial" w:hAnsi="Arial"/>
+          <w:color w:val="110663"/>
           <w:sz w:val="21"/>
           <w:szCs w:val="21"/>
         </w:rPr>
@@ -2693,15 +2978,17 @@
       <w:r>
         <w:rPr>
           <w:rFonts w:ascii="Arial" w:cs="Arial" w:eastAsia="Arial" w:hAnsi="Arial"/>
-          <w:sz w:val="21"/>
-          <w:szCs w:val="21"/>
-          <w:highlight w:val="yellow"/>
+          <w:color w:val="4C39CA"/>
+          <w:sz w:val="21"/>
+          <w:szCs w:val="21"/>
+          <w:shd w:fill="E6E0FB" w:color="auto" w:val="clear"/>
         </w:rPr>
         <w:t xml:space="preserve">[beløb]</w:t>
       </w:r>
       <w:r>
         <w:rPr>
           <w:rFonts w:ascii="Arial" w:cs="Arial" w:eastAsia="Arial" w:hAnsi="Arial"/>
+          <w:color w:val="110663"/>
           <w:sz w:val="21"/>
           <w:szCs w:val="21"/>
         </w:rPr>
@@ -2719,6 +3006,9 @@
       <w:r>
         <w:rPr>
           <w:rFonts w:ascii="Arial" w:cs="Arial" w:eastAsia="Arial" w:hAnsi="Arial"/>
+          <w:b/>
+          <w:bCs/>
+          <w:color w:val="4C39CA"/>
           <w:sz w:val="21"/>
           <w:szCs w:val="21"/>
         </w:rPr>
@@ -2733,6 +3023,7 @@
       <w:r>
         <w:rPr>
           <w:rFonts w:ascii="Arial" w:cs="Arial" w:eastAsia="Arial" w:hAnsi="Arial"/>
+          <w:color w:val="110663"/>
           <w:sz w:val="21"/>
           <w:szCs w:val="21"/>
         </w:rPr>
@@ -2742,10 +3033,14 @@
     <w:p>
       <w:pPr>
         <w:pBdr>
-          <w:left w:val="single" w:color="BFBFBF" w:sz="12" w:space="8"/>
+          <w:top w:val="single" w:color="F4F1FE" w:sz="4" w:space="6"/>
+          <w:left w:val="single" w:color="F4F1FE" w:sz="4" w:space="6"/>
+          <w:bottom w:val="single" w:color="F4F1FE" w:sz="4" w:space="6"/>
+          <w:right w:val="single" w:color="F4F1FE" w:sz="4" w:space="6"/>
         </w:pBdr>
-        <w:spacing w:after="160" w:line="264"/>
-        <w:ind w:left="567"/>
+        <w:shd w:fill="F4F1FE" w:color="auto" w:val="clear"/>
+        <w:spacing w:after="220" w:before="120" w:line="264"/>
+        <w:ind w:left="687" w:right="120"/>
       </w:pPr>
       <w:r>
         <w:rPr>
@@ -2754,7 +3049,7 @@
           <w:bCs/>
           <w:i/>
           <w:iCs/>
-          <w:color w:val="595959"/>
+          <w:color w:val="4C39CA"/>
           <w:sz w:val="19"/>
           <w:szCs w:val="19"/>
         </w:rPr>
@@ -2765,7 +3060,7 @@
           <w:rFonts w:ascii="Arial" w:cs="Arial" w:eastAsia="Arial" w:hAnsi="Arial"/>
           <w:i/>
           <w:iCs/>
-          <w:color w:val="595959"/>
+          <w:color w:val="4A4775"/>
           <w:sz w:val="19"/>
           <w:szCs w:val="19"/>
         </w:rPr>
@@ -2776,16 +3071,16 @@
       <w:pPr>
         <w:pStyle w:val="Heading2"/>
         <w:keepNext/>
-        <w:spacing w:after="120" w:before="280"/>
-      </w:pPr>
-      <w:r>
-        <w:rPr>
-          <w:rFonts w:ascii="Arial" w:cs="Arial" w:eastAsia="Arial" w:hAnsi="Arial"/>
-          <w:b/>
-          <w:bCs/>
-          <w:color w:val="1F2A44"/>
-          <w:sz w:val="24"/>
-          <w:szCs w:val="24"/>
+        <w:spacing w:after="140" w:before="400"/>
+      </w:pPr>
+      <w:r>
+        <w:rPr>
+          <w:rFonts w:ascii="Arial" w:cs="Arial" w:eastAsia="Arial" w:hAnsi="Arial"/>
+          <w:b w:val="false"/>
+          <w:bCs w:val="false"/>
+          <w:color w:val="110663"/>
+          <w:sz w:val="30"/>
+          <w:szCs w:val="30"/>
         </w:rPr>
         <w:t xml:space="preserve">9. Provision under ferie og fravær</w:t>
       </w:r>
@@ -2801,6 +3096,9 @@
       <w:r>
         <w:rPr>
           <w:rFonts w:ascii="Arial" w:cs="Arial" w:eastAsia="Arial" w:hAnsi="Arial"/>
+          <w:b/>
+          <w:bCs/>
+          <w:color w:val="4C39CA"/>
           <w:sz w:val="21"/>
           <w:szCs w:val="21"/>
         </w:rPr>
@@ -2815,6 +3113,7 @@
       <w:r>
         <w:rPr>
           <w:rFonts w:ascii="Arial" w:cs="Arial" w:eastAsia="Arial" w:hAnsi="Arial"/>
+          <w:color w:val="110663"/>
           <w:sz w:val="21"/>
           <w:szCs w:val="21"/>
         </w:rPr>
@@ -2823,15 +3122,17 @@
       <w:r>
         <w:rPr>
           <w:rFonts w:ascii="Arial" w:cs="Arial" w:eastAsia="Arial" w:hAnsi="Arial"/>
-          <w:sz w:val="21"/>
-          <w:szCs w:val="21"/>
-          <w:highlight w:val="yellow"/>
+          <w:color w:val="4C39CA"/>
+          <w:sz w:val="21"/>
+          <w:szCs w:val="21"/>
+          <w:shd w:fill="E6E0FB" w:color="auto" w:val="clear"/>
         </w:rPr>
         <w:t xml:space="preserve">[Vælg: 12,5 % af den provision, der blev optjent i det forudgående ferieår, med 1/25 pr. feriedag / gennemsnittet af den optjente provision pr. arbejdsdag i de seneste 12 måneder ganget med antal feriedage]</w:t>
       </w:r>
       <w:r>
         <w:rPr>
           <w:rFonts w:ascii="Arial" w:cs="Arial" w:eastAsia="Arial" w:hAnsi="Arial"/>
+          <w:color w:val="110663"/>
           <w:sz w:val="21"/>
           <w:szCs w:val="21"/>
         </w:rPr>
@@ -2849,6 +3150,9 @@
       <w:r>
         <w:rPr>
           <w:rFonts w:ascii="Arial" w:cs="Arial" w:eastAsia="Arial" w:hAnsi="Arial"/>
+          <w:b/>
+          <w:bCs/>
+          <w:color w:val="4C39CA"/>
           <w:sz w:val="21"/>
           <w:szCs w:val="21"/>
         </w:rPr>
@@ -2863,6 +3167,7 @@
       <w:r>
         <w:rPr>
           <w:rFonts w:ascii="Arial" w:cs="Arial" w:eastAsia="Arial" w:hAnsi="Arial"/>
+          <w:color w:val="110663"/>
           <w:sz w:val="21"/>
           <w:szCs w:val="21"/>
         </w:rPr>
@@ -2871,15 +3176,17 @@
       <w:r>
         <w:rPr>
           <w:rFonts w:ascii="Arial" w:cs="Arial" w:eastAsia="Arial" w:hAnsi="Arial"/>
-          <w:sz w:val="21"/>
-          <w:szCs w:val="21"/>
-          <w:highlight w:val="yellow"/>
+          <w:color w:val="4C39CA"/>
+          <w:sz w:val="21"/>
+          <w:szCs w:val="21"/>
+          <w:shd w:fill="E6E0FB" w:color="auto" w:val="clear"/>
         </w:rPr>
         <w:t xml:space="preserve">[fornyelser eller ordrer fra eget distrikt]</w:t>
       </w:r>
       <w:r>
         <w:rPr>
           <w:rFonts w:ascii="Arial" w:cs="Arial" w:eastAsia="Arial" w:hAnsi="Arial"/>
+          <w:color w:val="110663"/>
           <w:sz w:val="21"/>
           <w:szCs w:val="21"/>
         </w:rPr>
@@ -2888,15 +3195,17 @@
       <w:r>
         <w:rPr>
           <w:rFonts w:ascii="Arial" w:cs="Arial" w:eastAsia="Arial" w:hAnsi="Arial"/>
-          <w:sz w:val="21"/>
-          <w:szCs w:val="21"/>
-          <w:highlight w:val="yellow"/>
+          <w:color w:val="4C39CA"/>
+          <w:sz w:val="21"/>
+          <w:szCs w:val="21"/>
+          <w:shd w:fill="E6E0FB" w:color="auto" w:val="clear"/>
         </w:rPr>
         <w:t xml:space="preserve">[Vælg: modregnes i kompensationen / udbetales oven i kompensationen]</w:t>
       </w:r>
       <w:r>
         <w:rPr>
           <w:rFonts w:ascii="Arial" w:cs="Arial" w:eastAsia="Arial" w:hAnsi="Arial"/>
+          <w:color w:val="110663"/>
           <w:sz w:val="21"/>
           <w:szCs w:val="21"/>
         </w:rPr>
@@ -2914,6 +3223,9 @@
       <w:r>
         <w:rPr>
           <w:rFonts w:ascii="Arial" w:cs="Arial" w:eastAsia="Arial" w:hAnsi="Arial"/>
+          <w:b/>
+          <w:bCs/>
+          <w:color w:val="4C39CA"/>
           <w:sz w:val="21"/>
           <w:szCs w:val="21"/>
         </w:rPr>
@@ -2928,6 +3240,7 @@
       <w:r>
         <w:rPr>
           <w:rFonts w:ascii="Arial" w:cs="Arial" w:eastAsia="Arial" w:hAnsi="Arial"/>
+          <w:color w:val="110663"/>
           <w:sz w:val="21"/>
           <w:szCs w:val="21"/>
         </w:rPr>
@@ -2936,15 +3249,17 @@
       <w:r>
         <w:rPr>
           <w:rFonts w:ascii="Arial" w:cs="Arial" w:eastAsia="Arial" w:hAnsi="Arial"/>
-          <w:sz w:val="21"/>
-          <w:szCs w:val="21"/>
-          <w:highlight w:val="yellow"/>
+          <w:color w:val="4C39CA"/>
+          <w:sz w:val="21"/>
+          <w:szCs w:val="21"/>
+          <w:shd w:fill="E6E0FB" w:color="auto" w:val="clear"/>
         </w:rPr>
         <w:t xml:space="preserve">[Vælg: af den faste løn og provisionen / efter denne metode: beskriv metoden]</w:t>
       </w:r>
       <w:r>
         <w:rPr>
           <w:rFonts w:ascii="Arial" w:cs="Arial" w:eastAsia="Arial" w:hAnsi="Arial"/>
+          <w:color w:val="110663"/>
           <w:sz w:val="21"/>
           <w:szCs w:val="21"/>
         </w:rPr>
@@ -2962,6 +3277,9 @@
       <w:r>
         <w:rPr>
           <w:rFonts w:ascii="Arial" w:cs="Arial" w:eastAsia="Arial" w:hAnsi="Arial"/>
+          <w:b/>
+          <w:bCs/>
+          <w:color w:val="4C39CA"/>
           <w:sz w:val="21"/>
           <w:szCs w:val="21"/>
         </w:rPr>
@@ -2976,6 +3294,7 @@
       <w:r>
         <w:rPr>
           <w:rFonts w:ascii="Arial" w:cs="Arial" w:eastAsia="Arial" w:hAnsi="Arial"/>
+          <w:color w:val="110663"/>
           <w:sz w:val="21"/>
           <w:szCs w:val="21"/>
         </w:rPr>
@@ -2984,15 +3303,17 @@
       <w:r>
         <w:rPr>
           <w:rFonts w:ascii="Arial" w:cs="Arial" w:eastAsia="Arial" w:hAnsi="Arial"/>
-          <w:sz w:val="21"/>
-          <w:szCs w:val="21"/>
-          <w:highlight w:val="yellow"/>
+          <w:color w:val="4C39CA"/>
+          <w:sz w:val="21"/>
+          <w:szCs w:val="21"/>
+          <w:shd w:fill="E6E0FB" w:color="auto" w:val="clear"/>
         </w:rPr>
         <w:t xml:space="preserve">[12]</w:t>
       </w:r>
       <w:r>
         <w:rPr>
           <w:rFonts w:ascii="Arial" w:cs="Arial" w:eastAsia="Arial" w:hAnsi="Arial"/>
+          <w:color w:val="110663"/>
           <w:sz w:val="21"/>
           <w:szCs w:val="21"/>
         </w:rPr>
@@ -3001,15 +3322,17 @@
       <w:r>
         <w:rPr>
           <w:rFonts w:ascii="Arial" w:cs="Arial" w:eastAsia="Arial" w:hAnsi="Arial"/>
-          <w:sz w:val="21"/>
-          <w:szCs w:val="21"/>
-          <w:highlight w:val="yellow"/>
+          <w:color w:val="4C39CA"/>
+          <w:sz w:val="21"/>
+          <w:szCs w:val="21"/>
+          <w:shd w:fill="E6E0FB" w:color="auto" w:val="clear"/>
         </w:rPr>
         <w:t xml:space="preserve">[Vælg: indgår i det skønnede beløb / udbetales oven i det skønnede beløb]</w:t>
       </w:r>
       <w:r>
         <w:rPr>
           <w:rFonts w:ascii="Arial" w:cs="Arial" w:eastAsia="Arial" w:hAnsi="Arial"/>
+          <w:color w:val="110663"/>
           <w:sz w:val="21"/>
           <w:szCs w:val="21"/>
         </w:rPr>
@@ -3027,6 +3350,9 @@
       <w:r>
         <w:rPr>
           <w:rFonts w:ascii="Arial" w:cs="Arial" w:eastAsia="Arial" w:hAnsi="Arial"/>
+          <w:b/>
+          <w:bCs/>
+          <w:color w:val="4C39CA"/>
           <w:sz w:val="21"/>
           <w:szCs w:val="21"/>
         </w:rPr>
@@ -3041,6 +3367,7 @@
       <w:r>
         <w:rPr>
           <w:rFonts w:ascii="Arial" w:cs="Arial" w:eastAsia="Arial" w:hAnsi="Arial"/>
+          <w:color w:val="110663"/>
           <w:sz w:val="21"/>
           <w:szCs w:val="21"/>
         </w:rPr>
@@ -3049,9 +3376,10 @@
       <w:r>
         <w:rPr>
           <w:rFonts w:ascii="Arial" w:cs="Arial" w:eastAsia="Arial" w:hAnsi="Arial"/>
-          <w:sz w:val="21"/>
-          <w:szCs w:val="21"/>
-          <w:highlight w:val="yellow"/>
+          <w:color w:val="4C39CA"/>
+          <w:sz w:val="21"/>
+          <w:szCs w:val="21"/>
+          <w:shd w:fill="E6E0FB" w:color="auto" w:val="clear"/>
         </w:rPr>
         <w:t xml:space="preserve">[Giver overenskomst eller kontrakt fuld løn, indgår fuld skønnet provision.]</w:t>
       </w:r>
@@ -3059,10 +3387,14 @@
     <w:p>
       <w:pPr>
         <w:pBdr>
-          <w:left w:val="single" w:color="BFBFBF" w:sz="12" w:space="8"/>
+          <w:top w:val="single" w:color="F4F1FE" w:sz="4" w:space="6"/>
+          <w:left w:val="single" w:color="F4F1FE" w:sz="4" w:space="6"/>
+          <w:bottom w:val="single" w:color="F4F1FE" w:sz="4" w:space="6"/>
+          <w:right w:val="single" w:color="F4F1FE" w:sz="4" w:space="6"/>
         </w:pBdr>
-        <w:spacing w:after="160" w:line="264"/>
-        <w:ind w:left="567"/>
+        <w:shd w:fill="F4F1FE" w:color="auto" w:val="clear"/>
+        <w:spacing w:after="220" w:before="120" w:line="264"/>
+        <w:ind w:left="687" w:right="120"/>
       </w:pPr>
       <w:r>
         <w:rPr>
@@ -3071,7 +3403,7 @@
           <w:bCs/>
           <w:i/>
           <w:iCs/>
-          <w:color w:val="595959"/>
+          <w:color w:val="4C39CA"/>
           <w:sz w:val="19"/>
           <w:szCs w:val="19"/>
         </w:rPr>
@@ -3082,7 +3414,7 @@
           <w:rFonts w:ascii="Arial" w:cs="Arial" w:eastAsia="Arial" w:hAnsi="Arial"/>
           <w:i/>
           <w:iCs/>
-          <w:color w:val="595959"/>
+          <w:color w:val="4A4775"/>
           <w:sz w:val="19"/>
           <w:szCs w:val="19"/>
         </w:rPr>
@@ -3093,16 +3425,16 @@
       <w:pPr>
         <w:pStyle w:val="Heading2"/>
         <w:keepNext/>
-        <w:spacing w:after="120" w:before="280"/>
-      </w:pPr>
-      <w:r>
-        <w:rPr>
-          <w:rFonts w:ascii="Arial" w:cs="Arial" w:eastAsia="Arial" w:hAnsi="Arial"/>
-          <w:b/>
-          <w:bCs/>
-          <w:color w:val="1F2A44"/>
-          <w:sz w:val="24"/>
-          <w:szCs w:val="24"/>
+        <w:spacing w:after="140" w:before="400"/>
+      </w:pPr>
+      <w:r>
+        <w:rPr>
+          <w:rFonts w:ascii="Arial" w:cs="Arial" w:eastAsia="Arial" w:hAnsi="Arial"/>
+          <w:b w:val="false"/>
+          <w:bCs w:val="false"/>
+          <w:color w:val="110663"/>
+          <w:sz w:val="30"/>
+          <w:szCs w:val="30"/>
         </w:rPr>
         <w:t xml:space="preserve">10. Provision ved opsigelse og fratræden</w:t>
       </w:r>
@@ -3118,6 +3450,9 @@
       <w:r>
         <w:rPr>
           <w:rFonts w:ascii="Arial" w:cs="Arial" w:eastAsia="Arial" w:hAnsi="Arial"/>
+          <w:b/>
+          <w:bCs/>
+          <w:color w:val="4C39CA"/>
           <w:sz w:val="21"/>
           <w:szCs w:val="21"/>
         </w:rPr>
@@ -3132,6 +3467,7 @@
       <w:r>
         <w:rPr>
           <w:rFonts w:ascii="Arial" w:cs="Arial" w:eastAsia="Arial" w:hAnsi="Arial"/>
+          <w:color w:val="110663"/>
           <w:sz w:val="21"/>
           <w:szCs w:val="21"/>
         </w:rPr>
@@ -3149,6 +3485,9 @@
       <w:r>
         <w:rPr>
           <w:rFonts w:ascii="Arial" w:cs="Arial" w:eastAsia="Arial" w:hAnsi="Arial"/>
+          <w:b/>
+          <w:bCs/>
+          <w:color w:val="4C39CA"/>
           <w:sz w:val="21"/>
           <w:szCs w:val="21"/>
         </w:rPr>
@@ -3163,6 +3502,7 @@
       <w:r>
         <w:rPr>
           <w:rFonts w:ascii="Arial" w:cs="Arial" w:eastAsia="Arial" w:hAnsi="Arial"/>
+          <w:color w:val="110663"/>
           <w:sz w:val="21"/>
           <w:szCs w:val="21"/>
         </w:rPr>
@@ -3171,15 +3511,17 @@
       <w:r>
         <w:rPr>
           <w:rFonts w:ascii="Arial" w:cs="Arial" w:eastAsia="Arial" w:hAnsi="Arial"/>
-          <w:sz w:val="21"/>
-          <w:szCs w:val="21"/>
-          <w:highlight w:val="yellow"/>
+          <w:color w:val="4C39CA"/>
+          <w:sz w:val="21"/>
+          <w:szCs w:val="21"/>
+          <w:shd w:fill="E6E0FB" w:color="auto" w:val="clear"/>
         </w:rPr>
         <w:t xml:space="preserve">[underskrives / faktureres]</w:t>
       </w:r>
       <w:r>
         <w:rPr>
           <w:rFonts w:ascii="Arial" w:cs="Arial" w:eastAsia="Arial" w:hAnsi="Arial"/>
+          <w:color w:val="110663"/>
           <w:sz w:val="21"/>
           <w:szCs w:val="21"/>
         </w:rPr>
@@ -3188,15 +3530,17 @@
       <w:r>
         <w:rPr>
           <w:rFonts w:ascii="Arial" w:cs="Arial" w:eastAsia="Arial" w:hAnsi="Arial"/>
-          <w:sz w:val="21"/>
-          <w:szCs w:val="21"/>
-          <w:highlight w:val="yellow"/>
+          <w:color w:val="4C39CA"/>
+          <w:sz w:val="21"/>
+          <w:szCs w:val="21"/>
+          <w:shd w:fill="E6E0FB" w:color="auto" w:val="clear"/>
         </w:rPr>
         <w:t xml:space="preserve">[3]</w:t>
       </w:r>
       <w:r>
         <w:rPr>
           <w:rFonts w:ascii="Arial" w:cs="Arial" w:eastAsia="Arial" w:hAnsi="Arial"/>
+          <w:color w:val="110663"/>
           <w:sz w:val="21"/>
           <w:szCs w:val="21"/>
         </w:rPr>
@@ -3214,6 +3558,9 @@
       <w:r>
         <w:rPr>
           <w:rFonts w:ascii="Arial" w:cs="Arial" w:eastAsia="Arial" w:hAnsi="Arial"/>
+          <w:b/>
+          <w:bCs/>
+          <w:color w:val="4C39CA"/>
           <w:sz w:val="21"/>
           <w:szCs w:val="21"/>
         </w:rPr>
@@ -3228,6 +3575,7 @@
       <w:r>
         <w:rPr>
           <w:rFonts w:ascii="Arial" w:cs="Arial" w:eastAsia="Arial" w:hAnsi="Arial"/>
+          <w:color w:val="110663"/>
           <w:sz w:val="21"/>
           <w:szCs w:val="21"/>
         </w:rPr>
@@ -3236,15 +3584,17 @@
       <w:r>
         <w:rPr>
           <w:rFonts w:ascii="Arial" w:cs="Arial" w:eastAsia="Arial" w:hAnsi="Arial"/>
-          <w:sz w:val="21"/>
-          <w:szCs w:val="21"/>
-          <w:highlight w:val="yellow"/>
+          <w:color w:val="4C39CA"/>
+          <w:sz w:val="21"/>
+          <w:szCs w:val="21"/>
+          <w:shd w:fill="E6E0FB" w:color="auto" w:val="clear"/>
         </w:rPr>
         <w:t xml:space="preserve">[dato eller antal dage efter fratræden]</w:t>
       </w:r>
       <w:r>
         <w:rPr>
           <w:rFonts w:ascii="Arial" w:cs="Arial" w:eastAsia="Arial" w:hAnsi="Arial"/>
+          <w:color w:val="110663"/>
           <w:sz w:val="21"/>
           <w:szCs w:val="21"/>
         </w:rPr>
@@ -3254,10 +3604,14 @@
     <w:p>
       <w:pPr>
         <w:pBdr>
-          <w:left w:val="single" w:color="BFBFBF" w:sz="12" w:space="8"/>
+          <w:top w:val="single" w:color="F4F1FE" w:sz="4" w:space="6"/>
+          <w:left w:val="single" w:color="F4F1FE" w:sz="4" w:space="6"/>
+          <w:bottom w:val="single" w:color="F4F1FE" w:sz="4" w:space="6"/>
+          <w:right w:val="single" w:color="F4F1FE" w:sz="4" w:space="6"/>
         </w:pBdr>
-        <w:spacing w:after="160" w:line="264"/>
-        <w:ind w:left="567"/>
+        <w:shd w:fill="F4F1FE" w:color="auto" w:val="clear"/>
+        <w:spacing w:after="220" w:before="120" w:line="264"/>
+        <w:ind w:left="687" w:right="120"/>
       </w:pPr>
       <w:r>
         <w:rPr>
@@ -3266,7 +3620,7 @@
           <w:bCs/>
           <w:i/>
           <w:iCs/>
-          <w:color w:val="595959"/>
+          <w:color w:val="4C39CA"/>
           <w:sz w:val="19"/>
           <w:szCs w:val="19"/>
         </w:rPr>
@@ -3277,7 +3631,7 @@
           <w:rFonts w:ascii="Arial" w:cs="Arial" w:eastAsia="Arial" w:hAnsi="Arial"/>
           <w:i/>
           <w:iCs/>
-          <w:color w:val="595959"/>
+          <w:color w:val="4A4775"/>
           <w:sz w:val="19"/>
           <w:szCs w:val="19"/>
         </w:rPr>
@@ -3288,16 +3642,16 @@
       <w:pPr>
         <w:pStyle w:val="Heading2"/>
         <w:keepNext/>
-        <w:spacing w:after="120" w:before="280"/>
-      </w:pPr>
-      <w:r>
-        <w:rPr>
-          <w:rFonts w:ascii="Arial" w:cs="Arial" w:eastAsia="Arial" w:hAnsi="Arial"/>
-          <w:b/>
-          <w:bCs/>
-          <w:color w:val="1F2A44"/>
-          <w:sz w:val="24"/>
-          <w:szCs w:val="24"/>
+        <w:spacing w:after="140" w:before="400"/>
+      </w:pPr>
+      <w:r>
+        <w:rPr>
+          <w:rFonts w:ascii="Arial" w:cs="Arial" w:eastAsia="Arial" w:hAnsi="Arial"/>
+          <w:b w:val="false"/>
+          <w:bCs w:val="false"/>
+          <w:color w:val="110663"/>
+          <w:sz w:val="30"/>
+          <w:szCs w:val="30"/>
         </w:rPr>
         <w:t xml:space="preserve">11. Ændring af provisionsordningen</w:t>
       </w:r>
@@ -3313,6 +3667,9 @@
       <w:r>
         <w:rPr>
           <w:rFonts w:ascii="Arial" w:cs="Arial" w:eastAsia="Arial" w:hAnsi="Arial"/>
+          <w:b/>
+          <w:bCs/>
+          <w:color w:val="4C39CA"/>
           <w:sz w:val="21"/>
           <w:szCs w:val="21"/>
         </w:rPr>
@@ -3327,6 +3684,7 @@
       <w:r>
         <w:rPr>
           <w:rFonts w:ascii="Arial" w:cs="Arial" w:eastAsia="Arial" w:hAnsi="Arial"/>
+          <w:color w:val="110663"/>
           <w:sz w:val="21"/>
           <w:szCs w:val="21"/>
         </w:rPr>
@@ -3344,6 +3702,9 @@
       <w:r>
         <w:rPr>
           <w:rFonts w:ascii="Arial" w:cs="Arial" w:eastAsia="Arial" w:hAnsi="Arial"/>
+          <w:b/>
+          <w:bCs/>
+          <w:color w:val="4C39CA"/>
           <w:sz w:val="21"/>
           <w:szCs w:val="21"/>
         </w:rPr>
@@ -3358,6 +3719,7 @@
       <w:r>
         <w:rPr>
           <w:rFonts w:ascii="Arial" w:cs="Arial" w:eastAsia="Arial" w:hAnsi="Arial"/>
+          <w:color w:val="110663"/>
           <w:sz w:val="21"/>
           <w:szCs w:val="21"/>
         </w:rPr>
@@ -3375,6 +3737,9 @@
       <w:r>
         <w:rPr>
           <w:rFonts w:ascii="Arial" w:cs="Arial" w:eastAsia="Arial" w:hAnsi="Arial"/>
+          <w:b/>
+          <w:bCs/>
+          <w:color w:val="4C39CA"/>
           <w:sz w:val="21"/>
           <w:szCs w:val="21"/>
         </w:rPr>
@@ -3389,6 +3754,7 @@
       <w:r>
         <w:rPr>
           <w:rFonts w:ascii="Arial" w:cs="Arial" w:eastAsia="Arial" w:hAnsi="Arial"/>
+          <w:color w:val="110663"/>
           <w:sz w:val="21"/>
           <w:szCs w:val="21"/>
         </w:rPr>
@@ -3406,6 +3772,9 @@
       <w:r>
         <w:rPr>
           <w:rFonts w:ascii="Arial" w:cs="Arial" w:eastAsia="Arial" w:hAnsi="Arial"/>
+          <w:b/>
+          <w:bCs/>
+          <w:color w:val="4C39CA"/>
           <w:sz w:val="21"/>
           <w:szCs w:val="21"/>
         </w:rPr>
@@ -3420,6 +3789,7 @@
       <w:r>
         <w:rPr>
           <w:rFonts w:ascii="Arial" w:cs="Arial" w:eastAsia="Arial" w:hAnsi="Arial"/>
+          <w:color w:val="110663"/>
           <w:sz w:val="21"/>
           <w:szCs w:val="21"/>
         </w:rPr>
@@ -3428,15 +3798,17 @@
       <w:r>
         <w:rPr>
           <w:rFonts w:ascii="Arial" w:cs="Arial" w:eastAsia="Arial" w:hAnsi="Arial"/>
-          <w:sz w:val="21"/>
-          <w:szCs w:val="21"/>
-          <w:highlight w:val="yellow"/>
+          <w:color w:val="4C39CA"/>
+          <w:sz w:val="21"/>
+          <w:szCs w:val="21"/>
+          <w:shd w:fill="E6E0FB" w:color="auto" w:val="clear"/>
         </w:rPr>
         <w:t xml:space="preserve">[registreret i CRM / tilbudt kunden]</w:t>
       </w:r>
       <w:r>
         <w:rPr>
           <w:rFonts w:ascii="Arial" w:cs="Arial" w:eastAsia="Arial" w:hAnsi="Arial"/>
+          <w:color w:val="110663"/>
           <w:sz w:val="21"/>
           <w:szCs w:val="21"/>
         </w:rPr>
@@ -3445,15 +3817,17 @@
       <w:r>
         <w:rPr>
           <w:rFonts w:ascii="Arial" w:cs="Arial" w:eastAsia="Arial" w:hAnsi="Arial"/>
-          <w:sz w:val="21"/>
-          <w:szCs w:val="21"/>
-          <w:highlight w:val="yellow"/>
+          <w:color w:val="4C39CA"/>
+          <w:sz w:val="21"/>
+          <w:szCs w:val="21"/>
+          <w:shd w:fill="E6E0FB" w:color="auto" w:val="clear"/>
         </w:rPr>
         <w:t xml:space="preserve">[Vælg: den hidtidige / den nye]</w:t>
       </w:r>
       <w:r>
         <w:rPr>
           <w:rFonts w:ascii="Arial" w:cs="Arial" w:eastAsia="Arial" w:hAnsi="Arial"/>
+          <w:color w:val="110663"/>
           <w:sz w:val="21"/>
           <w:szCs w:val="21"/>
         </w:rPr>
@@ -3463,10 +3837,14 @@
     <w:p>
       <w:pPr>
         <w:pBdr>
-          <w:left w:val="single" w:color="BFBFBF" w:sz="12" w:space="8"/>
+          <w:top w:val="single" w:color="F4F1FE" w:sz="4" w:space="6"/>
+          <w:left w:val="single" w:color="F4F1FE" w:sz="4" w:space="6"/>
+          <w:bottom w:val="single" w:color="F4F1FE" w:sz="4" w:space="6"/>
+          <w:right w:val="single" w:color="F4F1FE" w:sz="4" w:space="6"/>
         </w:pBdr>
-        <w:spacing w:after="160" w:line="264"/>
-        <w:ind w:left="567"/>
+        <w:shd w:fill="F4F1FE" w:color="auto" w:val="clear"/>
+        <w:spacing w:after="220" w:before="120" w:line="264"/>
+        <w:ind w:left="687" w:right="120"/>
       </w:pPr>
       <w:r>
         <w:rPr>
@@ -3475,7 +3853,7 @@
           <w:bCs/>
           <w:i/>
           <w:iCs/>
-          <w:color w:val="595959"/>
+          <w:color w:val="4C39CA"/>
           <w:sz w:val="19"/>
           <w:szCs w:val="19"/>
         </w:rPr>
@@ -3486,7 +3864,7 @@
           <w:rFonts w:ascii="Arial" w:cs="Arial" w:eastAsia="Arial" w:hAnsi="Arial"/>
           <w:i/>
           <w:iCs/>
-          <w:color w:val="595959"/>
+          <w:color w:val="4A4775"/>
           <w:sz w:val="19"/>
           <w:szCs w:val="19"/>
         </w:rPr>
@@ -3497,16 +3875,16 @@
       <w:pPr>
         <w:pStyle w:val="Heading2"/>
         <w:keepNext/>
-        <w:spacing w:after="120" w:before="280"/>
-      </w:pPr>
-      <w:r>
-        <w:rPr>
-          <w:rFonts w:ascii="Arial" w:cs="Arial" w:eastAsia="Arial" w:hAnsi="Arial"/>
-          <w:b/>
-          <w:bCs/>
-          <w:color w:val="1F2A44"/>
-          <w:sz w:val="24"/>
-          <w:szCs w:val="24"/>
+        <w:spacing w:after="140" w:before="400"/>
+      </w:pPr>
+      <w:r>
+        <w:rPr>
+          <w:rFonts w:ascii="Arial" w:cs="Arial" w:eastAsia="Arial" w:hAnsi="Arial"/>
+          <w:b w:val="false"/>
+          <w:bCs w:val="false"/>
+          <w:color w:val="110663"/>
+          <w:sz w:val="30"/>
+          <w:szCs w:val="30"/>
         </w:rPr>
         <w:t xml:space="preserve">12. Uenighed</w:t>
       </w:r>
@@ -3522,6 +3900,9 @@
       <w:r>
         <w:rPr>
           <w:rFonts w:ascii="Arial" w:cs="Arial" w:eastAsia="Arial" w:hAnsi="Arial"/>
+          <w:b/>
+          <w:bCs/>
+          <w:color w:val="4C39CA"/>
           <w:sz w:val="21"/>
           <w:szCs w:val="21"/>
         </w:rPr>
@@ -3536,6 +3917,7 @@
       <w:r>
         <w:rPr>
           <w:rFonts w:ascii="Arial" w:cs="Arial" w:eastAsia="Arial" w:hAnsi="Arial"/>
+          <w:color w:val="110663"/>
           <w:sz w:val="21"/>
           <w:szCs w:val="21"/>
         </w:rPr>
@@ -3544,15 +3926,17 @@
       <w:r>
         <w:rPr>
           <w:rFonts w:ascii="Arial" w:cs="Arial" w:eastAsia="Arial" w:hAnsi="Arial"/>
-          <w:sz w:val="21"/>
-          <w:szCs w:val="21"/>
-          <w:highlight w:val="yellow"/>
+          <w:color w:val="4C39CA"/>
+          <w:sz w:val="21"/>
+          <w:szCs w:val="21"/>
+          <w:shd w:fill="E6E0FB" w:color="auto" w:val="clear"/>
         </w:rPr>
         <w:t xml:space="preserve">[nærmeste leder / HR]</w:t>
       </w:r>
       <w:r>
         <w:rPr>
           <w:rFonts w:ascii="Arial" w:cs="Arial" w:eastAsia="Arial" w:hAnsi="Arial"/>
+          <w:color w:val="110663"/>
           <w:sz w:val="21"/>
           <w:szCs w:val="21"/>
         </w:rPr>
@@ -3570,6 +3954,9 @@
       <w:r>
         <w:rPr>
           <w:rFonts w:ascii="Arial" w:cs="Arial" w:eastAsia="Arial" w:hAnsi="Arial"/>
+          <w:b/>
+          <w:bCs/>
+          <w:color w:val="4C39CA"/>
           <w:sz w:val="21"/>
           <w:szCs w:val="21"/>
         </w:rPr>
@@ -3584,6 +3971,7 @@
       <w:r>
         <w:rPr>
           <w:rFonts w:ascii="Arial" w:cs="Arial" w:eastAsia="Arial" w:hAnsi="Arial"/>
+          <w:color w:val="110663"/>
           <w:sz w:val="21"/>
           <w:szCs w:val="21"/>
         </w:rPr>
@@ -3592,15 +3980,17 @@
       <w:r>
         <w:rPr>
           <w:rFonts w:ascii="Arial" w:cs="Arial" w:eastAsia="Arial" w:hAnsi="Arial"/>
-          <w:sz w:val="21"/>
-          <w:szCs w:val="21"/>
-          <w:highlight w:val="yellow"/>
+          <w:color w:val="4C39CA"/>
+          <w:sz w:val="21"/>
+          <w:szCs w:val="21"/>
+          <w:shd w:fill="E6E0FB" w:color="auto" w:val="clear"/>
         </w:rPr>
         <w:t xml:space="preserve">[Vælg: efter overenskomstens regler / ved de almindelige domstole]</w:t>
       </w:r>
       <w:r>
         <w:rPr>
           <w:rFonts w:ascii="Arial" w:cs="Arial" w:eastAsia="Arial" w:hAnsi="Arial"/>
+          <w:color w:val="110663"/>
           <w:sz w:val="21"/>
           <w:szCs w:val="21"/>
         </w:rPr>
@@ -3610,10 +4000,14 @@
     <w:p>
       <w:pPr>
         <w:pBdr>
-          <w:left w:val="single" w:color="BFBFBF" w:sz="12" w:space="8"/>
+          <w:top w:val="single" w:color="F4F1FE" w:sz="4" w:space="6"/>
+          <w:left w:val="single" w:color="F4F1FE" w:sz="4" w:space="6"/>
+          <w:bottom w:val="single" w:color="F4F1FE" w:sz="4" w:space="6"/>
+          <w:right w:val="single" w:color="F4F1FE" w:sz="4" w:space="6"/>
         </w:pBdr>
-        <w:spacing w:after="160" w:line="264"/>
-        <w:ind w:left="567"/>
+        <w:shd w:fill="F4F1FE" w:color="auto" w:val="clear"/>
+        <w:spacing w:after="220" w:before="120" w:line="264"/>
+        <w:ind w:left="687" w:right="120"/>
       </w:pPr>
       <w:r>
         <w:rPr>
@@ -3622,7 +4016,7 @@
           <w:bCs/>
           <w:i/>
           <w:iCs/>
-          <w:color w:val="595959"/>
+          <w:color w:val="4C39CA"/>
           <w:sz w:val="19"/>
           <w:szCs w:val="19"/>
         </w:rPr>
@@ -3633,7 +4027,7 @@
           <w:rFonts w:ascii="Arial" w:cs="Arial" w:eastAsia="Arial" w:hAnsi="Arial"/>
           <w:i/>
           <w:iCs/>
-          <w:color w:val="595959"/>
+          <w:color w:val="4A4775"/>
           <w:sz w:val="19"/>
           <w:szCs w:val="19"/>
         </w:rPr>
@@ -3644,16 +4038,16 @@
       <w:pPr>
         <w:pStyle w:val="Heading2"/>
         <w:keepNext/>
-        <w:spacing w:after="120" w:before="280"/>
-      </w:pPr>
-      <w:r>
-        <w:rPr>
-          <w:rFonts w:ascii="Arial" w:cs="Arial" w:eastAsia="Arial" w:hAnsi="Arial"/>
-          <w:b/>
-          <w:bCs/>
-          <w:color w:val="1F2A44"/>
-          <w:sz w:val="24"/>
-          <w:szCs w:val="24"/>
+        <w:spacing w:after="140" w:before="400"/>
+      </w:pPr>
+      <w:r>
+        <w:rPr>
+          <w:rFonts w:ascii="Arial" w:cs="Arial" w:eastAsia="Arial" w:hAnsi="Arial"/>
+          <w:b w:val="false"/>
+          <w:bCs w:val="false"/>
+          <w:color w:val="110663"/>
+          <w:sz w:val="30"/>
+          <w:szCs w:val="30"/>
         </w:rPr>
         <w:t xml:space="preserve">13. Underskrifter</w:t>
       </w:r>
@@ -3665,6 +4059,7 @@
       <w:r>
         <w:rPr>
           <w:rFonts w:ascii="Arial" w:cs="Arial" w:eastAsia="Arial" w:hAnsi="Arial"/>
+          <w:color w:val="110663"/>
           <w:sz w:val="21"/>
           <w:szCs w:val="21"/>
         </w:rPr>
@@ -3680,12 +4075,12 @@
       <w:tblPr>
         <w:tblW w:type="dxa" w:w="9026"/>
         <w:tblBorders>
-          <w:top w:val="single" w:color="auto" w:sz="4"/>
-          <w:left w:val="single" w:color="auto" w:sz="4"/>
-          <w:bottom w:val="single" w:color="auto" w:sz="4"/>
-          <w:right w:val="single" w:color="auto" w:sz="4"/>
-          <w:insideH w:val="single" w:color="auto" w:sz="4"/>
-          <w:insideV w:val="single" w:color="auto" w:sz="4"/>
+          <w:top w:val="single" w:color="D9D5EA" w:sz="2"/>
+          <w:left w:val="single" w:color="D9D5EA" w:sz="2"/>
+          <w:bottom w:val="single" w:color="D9D5EA" w:sz="2"/>
+          <w:right w:val="single" w:color="D9D5EA" w:sz="2"/>
+          <w:insideH w:val="single" w:color="D9D5EA" w:sz="2"/>
+          <w:insideV w:val="single" w:color="D9D5EA" w:sz="2"/>
         </w:tblBorders>
       </w:tblPr>
       <w:tblGrid>
@@ -3700,17 +4095,17 @@
           <w:tcPr>
             <w:tcW w:type="dxa" w:w="4513"/>
             <w:tcBorders>
-              <w:top w:val="single" w:color="BFBFBF" w:sz="4"/>
-              <w:left w:val="single" w:color="BFBFBF" w:sz="4"/>
-              <w:bottom w:val="single" w:color="BFBFBF" w:sz="4"/>
-              <w:right w:val="single" w:color="BFBFBF" w:sz="4"/>
+              <w:top w:val="single" w:color="D9D5EA" w:sz="2"/>
+              <w:left w:val="single" w:color="D9D5EA" w:sz="2"/>
+              <w:bottom w:val="single" w:color="D9D5EA" w:sz="2"/>
+              <w:right w:val="single" w:color="D9D5EA" w:sz="2"/>
             </w:tcBorders>
-            <w:shd w:fill="DDE3EE" w:color="auto" w:val="clear"/>
+            <w:shd w:fill="F4F1FE" w:color="auto" w:val="clear"/>
             <w:tcMar>
-              <w:top w:type="dxa" w:w="60"/>
-              <w:left w:type="dxa" w:w="100"/>
-              <w:bottom w:type="dxa" w:w="60"/>
-              <w:right w:type="dxa" w:w="100"/>
+              <w:top w:type="dxa" w:w="80"/>
+              <w:left w:type="dxa" w:w="120"/>
+              <w:bottom w:type="dxa" w:w="80"/>
+              <w:right w:type="dxa" w:w="120"/>
             </w:tcMar>
           </w:tcPr>
           <w:p>
@@ -3722,6 +4117,7 @@
                 <w:rFonts w:ascii="Arial" w:cs="Arial" w:eastAsia="Arial" w:hAnsi="Arial"/>
                 <w:b/>
                 <w:bCs/>
+                <w:color w:val="110663"/>
                 <w:sz w:val="19"/>
                 <w:szCs w:val="19"/>
               </w:rPr>
@@ -3733,17 +4129,17 @@
           <w:tcPr>
             <w:tcW w:type="dxa" w:w="4513"/>
             <w:tcBorders>
-              <w:top w:val="single" w:color="BFBFBF" w:sz="4"/>
-              <w:left w:val="single" w:color="BFBFBF" w:sz="4"/>
-              <w:bottom w:val="single" w:color="BFBFBF" w:sz="4"/>
-              <w:right w:val="single" w:color="BFBFBF" w:sz="4"/>
+              <w:top w:val="single" w:color="D9D5EA" w:sz="2"/>
+              <w:left w:val="single" w:color="D9D5EA" w:sz="2"/>
+              <w:bottom w:val="single" w:color="D9D5EA" w:sz="2"/>
+              <w:right w:val="single" w:color="D9D5EA" w:sz="2"/>
             </w:tcBorders>
-            <w:shd w:fill="DDE3EE" w:color="auto" w:val="clear"/>
+            <w:shd w:fill="F4F1FE" w:color="auto" w:val="clear"/>
             <w:tcMar>
-              <w:top w:type="dxa" w:w="60"/>
-              <w:left w:type="dxa" w:w="100"/>
-              <w:bottom w:type="dxa" w:w="60"/>
-              <w:right w:type="dxa" w:w="100"/>
+              <w:top w:type="dxa" w:w="80"/>
+              <w:left w:type="dxa" w:w="120"/>
+              <w:bottom w:type="dxa" w:w="80"/>
+              <w:right w:type="dxa" w:w="120"/>
             </w:tcMar>
           </w:tcPr>
           <w:p>
@@ -3755,6 +4151,7 @@
                 <w:rFonts w:ascii="Arial" w:cs="Arial" w:eastAsia="Arial" w:hAnsi="Arial"/>
                 <w:b/>
                 <w:bCs/>
+                <w:color w:val="110663"/>
                 <w:sz w:val="19"/>
                 <w:szCs w:val="19"/>
               </w:rPr>
@@ -3771,16 +4168,16 @@
           <w:tcPr>
             <w:tcW w:type="dxa" w:w="4513"/>
             <w:tcBorders>
-              <w:top w:val="single" w:color="BFBFBF" w:sz="4"/>
-              <w:left w:val="single" w:color="BFBFBF" w:sz="4"/>
-              <w:bottom w:val="single" w:color="BFBFBF" w:sz="4"/>
-              <w:right w:val="single" w:color="BFBFBF" w:sz="4"/>
+              <w:top w:val="single" w:color="D9D5EA" w:sz="2"/>
+              <w:left w:val="single" w:color="D9D5EA" w:sz="2"/>
+              <w:bottom w:val="single" w:color="D9D5EA" w:sz="2"/>
+              <w:right w:val="single" w:color="D9D5EA" w:sz="2"/>
             </w:tcBorders>
             <w:tcMar>
-              <w:top w:type="dxa" w:w="60"/>
-              <w:left w:type="dxa" w:w="100"/>
-              <w:bottom w:type="dxa" w:w="60"/>
-              <w:right w:type="dxa" w:w="100"/>
+              <w:top w:type="dxa" w:w="80"/>
+              <w:left w:type="dxa" w:w="120"/>
+              <w:bottom w:type="dxa" w:w="80"/>
+              <w:right w:type="dxa" w:w="120"/>
             </w:tcMar>
           </w:tcPr>
           <w:p>
@@ -3792,6 +4189,7 @@
                 <w:rFonts w:ascii="Arial" w:cs="Arial" w:eastAsia="Arial" w:hAnsi="Arial"/>
                 <w:b w:val="false"/>
                 <w:bCs w:val="false"/>
+                <w:color w:val="110663"/>
                 <w:sz w:val="19"/>
                 <w:szCs w:val="19"/>
               </w:rPr>
@@ -3802,9 +4200,10 @@
                 <w:rFonts w:ascii="Arial" w:cs="Arial" w:eastAsia="Arial" w:hAnsi="Arial"/>
                 <w:b w:val="false"/>
                 <w:bCs w:val="false"/>
+                <w:color w:val="4C39CA"/>
                 <w:sz w:val="19"/>
                 <w:szCs w:val="19"/>
-                <w:highlight w:val="yellow"/>
+                <w:shd w:fill="E6E0FB" w:color="auto" w:val="clear"/>
               </w:rPr>
               <w:t xml:space="preserve">[                    ]</w:t>
             </w:r>
@@ -3814,16 +4213,16 @@
           <w:tcPr>
             <w:tcW w:type="dxa" w:w="4513"/>
             <w:tcBorders>
-              <w:top w:val="single" w:color="BFBFBF" w:sz="4"/>
-              <w:left w:val="single" w:color="BFBFBF" w:sz="4"/>
-              <w:bottom w:val="single" w:color="BFBFBF" w:sz="4"/>
-              <w:right w:val="single" w:color="BFBFBF" w:sz="4"/>
+              <w:top w:val="single" w:color="D9D5EA" w:sz="2"/>
+              <w:left w:val="single" w:color="D9D5EA" w:sz="2"/>
+              <w:bottom w:val="single" w:color="D9D5EA" w:sz="2"/>
+              <w:right w:val="single" w:color="D9D5EA" w:sz="2"/>
             </w:tcBorders>
             <w:tcMar>
-              <w:top w:type="dxa" w:w="60"/>
-              <w:left w:type="dxa" w:w="100"/>
-              <w:bottom w:type="dxa" w:w="60"/>
-              <w:right w:type="dxa" w:w="100"/>
+              <w:top w:type="dxa" w:w="80"/>
+              <w:left w:type="dxa" w:w="120"/>
+              <w:bottom w:type="dxa" w:w="80"/>
+              <w:right w:type="dxa" w:w="120"/>
             </w:tcMar>
           </w:tcPr>
           <w:p>
@@ -3835,6 +4234,7 @@
                 <w:rFonts w:ascii="Arial" w:cs="Arial" w:eastAsia="Arial" w:hAnsi="Arial"/>
                 <w:b w:val="false"/>
                 <w:bCs w:val="false"/>
+                <w:color w:val="110663"/>
                 <w:sz w:val="19"/>
                 <w:szCs w:val="19"/>
               </w:rPr>
@@ -3845,9 +4245,10 @@
                 <w:rFonts w:ascii="Arial" w:cs="Arial" w:eastAsia="Arial" w:hAnsi="Arial"/>
                 <w:b w:val="false"/>
                 <w:bCs w:val="false"/>
+                <w:color w:val="4C39CA"/>
                 <w:sz w:val="19"/>
                 <w:szCs w:val="19"/>
-                <w:highlight w:val="yellow"/>
+                <w:shd w:fill="E6E0FB" w:color="auto" w:val="clear"/>
               </w:rPr>
               <w:t xml:space="preserve">[                    ]</w:t>
             </w:r>
@@ -3862,16 +4263,16 @@
           <w:tcPr>
             <w:tcW w:type="dxa" w:w="4513"/>
             <w:tcBorders>
-              <w:top w:val="single" w:color="BFBFBF" w:sz="4"/>
-              <w:left w:val="single" w:color="BFBFBF" w:sz="4"/>
-              <w:bottom w:val="single" w:color="BFBFBF" w:sz="4"/>
-              <w:right w:val="single" w:color="BFBFBF" w:sz="4"/>
+              <w:top w:val="single" w:color="D9D5EA" w:sz="2"/>
+              <w:left w:val="single" w:color="D9D5EA" w:sz="2"/>
+              <w:bottom w:val="single" w:color="D9D5EA" w:sz="2"/>
+              <w:right w:val="single" w:color="D9D5EA" w:sz="2"/>
             </w:tcBorders>
             <w:tcMar>
-              <w:top w:type="dxa" w:w="60"/>
-              <w:left w:type="dxa" w:w="100"/>
-              <w:bottom w:type="dxa" w:w="60"/>
-              <w:right w:type="dxa" w:w="100"/>
+              <w:top w:type="dxa" w:w="80"/>
+              <w:left w:type="dxa" w:w="120"/>
+              <w:bottom w:type="dxa" w:w="80"/>
+              <w:right w:type="dxa" w:w="120"/>
             </w:tcMar>
           </w:tcPr>
           <w:p>
@@ -3884,6 +4285,7 @@
                 <w:rFonts w:ascii="Arial" w:cs="Arial" w:eastAsia="Arial" w:hAnsi="Arial"/>
                 <w:b w:val="false"/>
                 <w:bCs w:val="false"/>
+                <w:color w:val="110663"/>
                 <w:sz w:val="19"/>
                 <w:szCs w:val="19"/>
               </w:rPr>
@@ -3895,16 +4297,16 @@
           <w:tcPr>
             <w:tcW w:type="dxa" w:w="4513"/>
             <w:tcBorders>
-              <w:top w:val="single" w:color="BFBFBF" w:sz="4"/>
-              <w:left w:val="single" w:color="BFBFBF" w:sz="4"/>
-              <w:bottom w:val="single" w:color="BFBFBF" w:sz="4"/>
-              <w:right w:val="single" w:color="BFBFBF" w:sz="4"/>
+              <w:top w:val="single" w:color="D9D5EA" w:sz="2"/>
+              <w:left w:val="single" w:color="D9D5EA" w:sz="2"/>
+              <w:bottom w:val="single" w:color="D9D5EA" w:sz="2"/>
+              <w:right w:val="single" w:color="D9D5EA" w:sz="2"/>
             </w:tcBorders>
             <w:tcMar>
-              <w:top w:type="dxa" w:w="60"/>
-              <w:left w:type="dxa" w:w="100"/>
-              <w:bottom w:type="dxa" w:w="60"/>
-              <w:right w:type="dxa" w:w="100"/>
+              <w:top w:type="dxa" w:w="80"/>
+              <w:left w:type="dxa" w:w="120"/>
+              <w:bottom w:type="dxa" w:w="80"/>
+              <w:right w:type="dxa" w:w="120"/>
             </w:tcMar>
           </w:tcPr>
           <w:p>
@@ -3917,6 +4319,7 @@
                 <w:rFonts w:ascii="Arial" w:cs="Arial" w:eastAsia="Arial" w:hAnsi="Arial"/>
                 <w:b w:val="false"/>
                 <w:bCs w:val="false"/>
+                <w:color w:val="110663"/>
                 <w:sz w:val="19"/>
                 <w:szCs w:val="19"/>
               </w:rPr>
@@ -3933,16 +4336,16 @@
           <w:tcPr>
             <w:tcW w:type="dxa" w:w="4513"/>
             <w:tcBorders>
-              <w:top w:val="single" w:color="BFBFBF" w:sz="4"/>
-              <w:left w:val="single" w:color="BFBFBF" w:sz="4"/>
-              <w:bottom w:val="single" w:color="BFBFBF" w:sz="4"/>
-              <w:right w:val="single" w:color="BFBFBF" w:sz="4"/>
+              <w:top w:val="single" w:color="D9D5EA" w:sz="2"/>
+              <w:left w:val="single" w:color="D9D5EA" w:sz="2"/>
+              <w:bottom w:val="single" w:color="D9D5EA" w:sz="2"/>
+              <w:right w:val="single" w:color="D9D5EA" w:sz="2"/>
             </w:tcBorders>
             <w:tcMar>
-              <w:top w:type="dxa" w:w="60"/>
-              <w:left w:type="dxa" w:w="100"/>
-              <w:bottom w:type="dxa" w:w="60"/>
-              <w:right w:type="dxa" w:w="100"/>
+              <w:top w:type="dxa" w:w="80"/>
+              <w:left w:type="dxa" w:w="120"/>
+              <w:bottom w:type="dxa" w:w="80"/>
+              <w:right w:type="dxa" w:w="120"/>
             </w:tcMar>
           </w:tcPr>
           <w:p>
@@ -3954,9 +4357,10 @@
                 <w:rFonts w:ascii="Arial" w:cs="Arial" w:eastAsia="Arial" w:hAnsi="Arial"/>
                 <w:b w:val="false"/>
                 <w:bCs w:val="false"/>
+                <w:color w:val="4C39CA"/>
                 <w:sz w:val="19"/>
                 <w:szCs w:val="19"/>
-                <w:highlight w:val="yellow"/>
+                <w:shd w:fill="E6E0FB" w:color="auto" w:val="clear"/>
               </w:rPr>
               <w:t xml:space="preserve">[Navn og titel]</w:t>
             </w:r>
@@ -3966,16 +4370,16 @@
           <w:tcPr>
             <w:tcW w:type="dxa" w:w="4513"/>
             <w:tcBorders>
-              <w:top w:val="single" w:color="BFBFBF" w:sz="4"/>
-              <w:left w:val="single" w:color="BFBFBF" w:sz="4"/>
-              <w:bottom w:val="single" w:color="BFBFBF" w:sz="4"/>
-              <w:right w:val="single" w:color="BFBFBF" w:sz="4"/>
+              <w:top w:val="single" w:color="D9D5EA" w:sz="2"/>
+              <w:left w:val="single" w:color="D9D5EA" w:sz="2"/>
+              <w:bottom w:val="single" w:color="D9D5EA" w:sz="2"/>
+              <w:right w:val="single" w:color="D9D5EA" w:sz="2"/>
             </w:tcBorders>
             <w:tcMar>
-              <w:top w:type="dxa" w:w="60"/>
-              <w:left w:type="dxa" w:w="100"/>
-              <w:bottom w:type="dxa" w:w="60"/>
-              <w:right w:type="dxa" w:w="100"/>
+              <w:top w:type="dxa" w:w="80"/>
+              <w:left w:type="dxa" w:w="120"/>
+              <w:bottom w:type="dxa" w:w="80"/>
+              <w:right w:type="dxa" w:w="120"/>
             </w:tcMar>
           </w:tcPr>
           <w:p>
@@ -3987,9 +4391,10 @@
                 <w:rFonts w:ascii="Arial" w:cs="Arial" w:eastAsia="Arial" w:hAnsi="Arial"/>
                 <w:b w:val="false"/>
                 <w:bCs w:val="false"/>
+                <w:color w:val="4C39CA"/>
                 <w:sz w:val="19"/>
                 <w:szCs w:val="19"/>
-                <w:highlight w:val="yellow"/>
+                <w:shd w:fill="E6E0FB" w:color="auto" w:val="clear"/>
               </w:rPr>
               <w:t xml:space="preserve">[Navn]</w:t>
             </w:r>
@@ -3998,9 +4403,10 @@
       </w:tr>
     </w:tbl>
     <w:sectPr>
-      <w:footerReference w:type="default" r:id="rId6"/>
+      <w:headerReference w:type="default" r:id="rId6"/>
+      <w:footerReference w:type="default" r:id="rId7"/>
       <w:pgSz w:w="11906" w:h="16838" w:orient="portrait"/>
-      <w:pgMar w:top="1300" w:right="1440" w:bottom="1300" w:left="1440" w:header="708" w:footer="708" w:gutter="0"/>
+      <w:pgMar w:top="1500" w:right="1440" w:bottom="1300" w:left="1440" w:header="600" w:footer="560" w:gutter="0"/>
       <w:pgNumType/>
       <w:docGrid w:linePitch="360"/>
     </w:sectPr>
@@ -4049,21 +4455,45 @@
 <w:ftr xmlns:wpc="http://schemas.microsoft.com/office/word/2010/wordprocessingCanvas" xmlns:mc="http://schemas.openxmlformats.org/markup-compatibility/2006" xmlns:o="urn:schemas-microsoft-com:office:office" xmlns:r="http://schemas.openxmlformats.org/officeDocument/2006/relationships" xmlns:m="http://schemas.openxmlformats.org/officeDocument/2006/math" xmlns:v="urn:schemas-microsoft-com:vml" xmlns:wp14="http://schemas.microsoft.com/office/word/2010/wordprocessingDrawing" xmlns:wp="http://schemas.openxmlformats.org/drawingml/2006/wordprocessingDrawing" xmlns:w10="urn:schemas-microsoft-com:office:word" xmlns:w="http://schemas.openxmlformats.org/wordprocessingml/2006/main" xmlns:w14="http://schemas.microsoft.com/office/word/2010/wordml" xmlns:w15="http://schemas.microsoft.com/office/word/2012/wordml" xmlns:wpg="http://schemas.microsoft.com/office/word/2010/wordprocessingGroup" xmlns:wpi="http://schemas.microsoft.com/office/word/2010/wordprocessingInk" xmlns:wne="http://schemas.microsoft.com/office/word/2006/wordml" xmlns:wps="http://schemas.microsoft.com/office/word/2010/wordprocessingShape">
   <w:p>
     <w:pPr>
-      <w:jc w:val="right"/>
+      <w:pStyle w:val="Footer"/>
+      <w:pBdr>
+        <w:top w:val="single" w:color="D9D5EA" w:sz="2" w:space="6"/>
+      </w:pBdr>
+      <w:tabs>
+        <w:tab w:val="right" w:pos="9026"/>
+      </w:tabs>
     </w:pPr>
     <w:r>
       <w:rPr>
         <w:rFonts w:ascii="Arial" w:cs="Arial" w:eastAsia="Arial" w:hAnsi="Arial"/>
-        <w:color w:val="595959"/>
+        <w:color w:val="A1A0BD"/>
         <w:sz w:val="16"/>
         <w:szCs w:val="16"/>
       </w:rPr>
-      <w:t xml:space="preserve">Provisionsaftale  |  Side </w:t>
+      <w:t xml:space="preserve">prowi.io · Gratis skabelon fra Prowi · Ikke juridisk rådgivning</w:t>
     </w:r>
     <w:r>
       <w:rPr>
         <w:rFonts w:ascii="Arial" w:cs="Arial" w:eastAsia="Arial" w:hAnsi="Arial"/>
-        <w:color w:val="595959"/>
+        <w:color w:val="A1A0BD"/>
+        <w:sz w:val="16"/>
+        <w:szCs w:val="16"/>
+      </w:rPr>
+      <w:t xml:space="preserve">	</w:t>
+    </w:r>
+    <w:r>
+      <w:rPr>
+        <w:rFonts w:ascii="Arial" w:cs="Arial" w:eastAsia="Arial" w:hAnsi="Arial"/>
+        <w:color w:val="A1A0BD"/>
+        <w:sz w:val="16"/>
+        <w:szCs w:val="16"/>
+      </w:rPr>
+      <w:t xml:space="preserve">Side </w:t>
+    </w:r>
+    <w:r>
+      <w:rPr>
+        <w:rFonts w:ascii="Arial" w:cs="Arial" w:eastAsia="Arial" w:hAnsi="Arial"/>
+        <w:color w:val="A1A0BD"/>
         <w:sz w:val="16"/>
         <w:szCs w:val="16"/>
       </w:rPr>
@@ -4075,7 +4505,7 @@
     <w:r>
       <w:rPr>
         <w:rFonts w:ascii="Arial" w:cs="Arial" w:eastAsia="Arial" w:hAnsi="Arial"/>
-        <w:color w:val="595959"/>
+        <w:color w:val="A1A0BD"/>
         <w:sz w:val="16"/>
         <w:szCs w:val="16"/>
       </w:rPr>
@@ -4084,7 +4514,7 @@
     <w:r>
       <w:rPr>
         <w:rFonts w:ascii="Arial" w:cs="Arial" w:eastAsia="Arial" w:hAnsi="Arial"/>
-        <w:color w:val="595959"/>
+        <w:color w:val="A1A0BD"/>
         <w:sz w:val="16"/>
         <w:szCs w:val="16"/>
       </w:rPr>
@@ -4132,6 +4562,78 @@
     </w:p>
   </w:footnote>
 </w:footnotes>
+</file>
+
+<file path=word/header1.xml><?xml version="1.0" encoding="utf-8"?>
+<w:hdr xmlns:wpc="http://schemas.microsoft.com/office/word/2010/wordprocessingCanvas" xmlns:mc="http://schemas.openxmlformats.org/markup-compatibility/2006" xmlns:o="urn:schemas-microsoft-com:office:office" xmlns:r="http://schemas.openxmlformats.org/officeDocument/2006/relationships" xmlns:m="http://schemas.openxmlformats.org/officeDocument/2006/math" xmlns:v="urn:schemas-microsoft-com:vml" xmlns:wp14="http://schemas.microsoft.com/office/word/2010/wordprocessingDrawing" xmlns:wp="http://schemas.openxmlformats.org/drawingml/2006/wordprocessingDrawing" xmlns:w10="urn:schemas-microsoft-com:office:word" xmlns:w="http://schemas.openxmlformats.org/wordprocessingml/2006/main" xmlns:w14="http://schemas.microsoft.com/office/word/2010/wordml" xmlns:w15="http://schemas.microsoft.com/office/word/2012/wordml" xmlns:wpg="http://schemas.microsoft.com/office/word/2010/wordprocessingGroup" xmlns:wpi="http://schemas.microsoft.com/office/word/2010/wordprocessingInk" xmlns:wne="http://schemas.microsoft.com/office/word/2006/wordml" xmlns:wps="http://schemas.microsoft.com/office/word/2010/wordprocessingShape" xmlns:cx="http://schemas.microsoft.com/office/drawing/2014/chartex" xmlns:cx1="http://schemas.microsoft.com/office/drawing/2015/9/8/chartex" xmlns:cx2="http://schemas.microsoft.com/office/drawing/2015/10/21/chartex" xmlns:cx3="http://schemas.microsoft.com/office/drawing/2016/5/9/chartex" xmlns:cx4="http://schemas.microsoft.com/office/drawing/2016/5/10/chartex" xmlns:cx5="http://schemas.microsoft.com/office/drawing/2016/5/11/chartex" xmlns:cx6="http://schemas.microsoft.com/office/drawing/2016/5/12/chartex" xmlns:cx7="http://schemas.microsoft.com/office/drawing/2016/5/13/chartex" xmlns:cx8="http://schemas.microsoft.com/office/drawing/2016/5/14/chartex" xmlns:w16cid="http://schemas.microsoft.com/office/word/2016/wordml/cid" xmlns:w16se="http://schemas.microsoft.com/office/word/2015/wordml/symex">
+  <w:p>
+    <w:pPr>
+      <w:pBdr>
+        <w:bottom w:val="single" w:color="D9D5EA" w:sz="2" w:space="6"/>
+      </w:pBdr>
+      <w:tabs>
+        <w:tab w:val="right" w:pos="9026"/>
+      </w:tabs>
+    </w:pPr>
+    <w:r>
+      <w:drawing>
+        <wp:inline distT="0" distB="0" distL="0" distR="0">
+          <wp:extent cx="838200" cy="257175"/>
+          <wp:effectExtent t="0" r="0" b="0" l="0"/>
+          <wp:docPr id="1" name="Prowi" descr="Prowi logo" title="Prowi"/>
+          <wp:cNvGraphicFramePr>
+            <a:graphicFrameLocks xmlns:a="http://schemas.openxmlformats.org/drawingml/2006/main" noChangeAspect="1"/>
+          </wp:cNvGraphicFramePr>
+          <a:graphic xmlns:a="http://schemas.openxmlformats.org/drawingml/2006/main">
+            <a:graphicData uri="http://schemas.openxmlformats.org/drawingml/2006/picture">
+              <pic:pic xmlns:pic="http://schemas.openxmlformats.org/drawingml/2006/picture">
+                <pic:nvPicPr>
+                  <pic:cNvPr id="0" name="" descr=""/>
+                  <pic:cNvPicPr>
+                    <a:picLocks noChangeAspect="1" noChangeArrowheads="1"/>
+                  </pic:cNvPicPr>
+                </pic:nvPicPr>
+                <pic:blipFill>
+                  <a:blip r:embed="rId0" cstate="none"/>
+                  <a:srcRect/>
+                  <a:stretch>
+                    <a:fillRect/>
+                  </a:stretch>
+                </pic:blipFill>
+                <pic:spPr bwMode="auto">
+                  <a:xfrm>
+                    <a:off x="0" y="0"/>
+                    <a:ext cx="838200" cy="257175"/>
+                  </a:xfrm>
+                  <a:prstGeom prst="rect">
+                    <a:avLst/>
+                  </a:prstGeom>
+                </pic:spPr>
+              </pic:pic>
+            </a:graphicData>
+          </a:graphic>
+        </wp:inline>
+      </w:drawing>
+    </w:r>
+    <w:r>
+      <w:rPr>
+        <w:rFonts w:ascii="Arial" w:cs="Arial" w:eastAsia="Arial" w:hAnsi="Arial"/>
+        <w:sz w:val="17"/>
+        <w:szCs w:val="17"/>
+      </w:rPr>
+      <w:t xml:space="preserve">	</w:t>
+    </w:r>
+    <w:r>
+      <w:rPr>
+        <w:rFonts w:ascii="Arial" w:cs="Arial" w:eastAsia="Arial" w:hAnsi="Arial"/>
+        <w:color w:val="A1A0BD"/>
+        <w:sz w:val="17"/>
+        <w:szCs w:val="17"/>
+      </w:rPr>
+      <w:t xml:space="preserve">Provisionsaftale · Skabelon</w:t>
+    </w:r>
+  </w:p>
+</w:hdr>
 </file>
 
 <file path=word/numbering.xml><?xml version="1.0" encoding="utf-8"?>
@@ -4235,6 +4737,7 @@
     <w:rPrDefault>
       <w:rPr>
         <w:rFonts w:ascii="Arial" w:cs="Arial" w:eastAsia="Arial" w:hAnsi="Arial"/>
+        <w:color w:val="110663"/>
         <w:sz w:val="21"/>
         <w:szCs w:val="21"/>
       </w:rPr>
@@ -4264,17 +4767,6 @@
       <w:color w:val="2E74B5"/>
       <w:sz w:val="32"/>
       <w:szCs w:val="32"/>
-    </w:rPr>
-  </w:style>
-  <w:style w:type="paragraph" w:styleId="Heading2">
-    <w:name w:val="Heading 2"/>
-    <w:basedOn w:val="Normal"/>
-    <w:next w:val="Normal"/>
-    <w:qFormat/>
-    <w:rPr>
-      <w:color w:val="2E74B5"/>
-      <w:sz w:val="26"/>
-      <w:szCs w:val="26"/>
     </w:rPr>
   </w:style>
   <w:style w:type="paragraph" w:styleId="Heading3">
@@ -4414,6 +4906,34 @@
     <w:rPr>
       <w:sz w:val="20"/>
       <w:szCs w:val="20"/>
+    </w:rPr>
+  </w:style>
+  <w:style w:type="paragraph" w:styleId="Footer">
+    <w:name w:val="footer"/>
+    <w:basedOn w:val="Normal"/>
+    <w:rPr>
+      <w:rFonts w:ascii="Arial" w:cs="Arial" w:eastAsia="Arial" w:hAnsi="Arial"/>
+      <w:color w:val="A1A0BD"/>
+      <w:sz w:val="16"/>
+      <w:szCs w:val="16"/>
+    </w:rPr>
+  </w:style>
+  <w:style w:type="paragraph" w:styleId="Heading2">
+    <w:name w:val="Heading 2"/>
+    <w:basedOn w:val="Normal"/>
+    <w:next w:val="Normal"/>
+    <w:qFormat/>
+    <w:pPr>
+      <w:spacing w:after="140" w:before="400"/>
+      <w:outlineLvl w:val="1"/>
+    </w:pPr>
+    <w:rPr>
+      <w:rFonts w:ascii="Arial" w:cs="Arial" w:eastAsia="Arial" w:hAnsi="Arial"/>
+      <w:b w:val="false"/>
+      <w:bCs w:val="false"/>
+      <w:color w:val="110663"/>
+      <w:sz w:val="30"/>
+      <w:szCs w:val="30"/>
     </w:rPr>
   </w:style>
 </w:styles>

</xml_diff>